<commit_message>
java springboot on Mon, Sep 14, 2026  12:26:01 PM
</commit_message>
<xml_diff>
--- a/Java/spring_boot.docx
+++ b/Java/spring_boot.docx
@@ -1,6 +1,6 @@
 
 <file path=word/document.xml><?xml version="1.0" encoding="utf-8"?>
-<w:document xmlns:wpc="http://schemas.microsoft.com/office/word/2010/wordprocessingCanvas" xmlns:cx="http://schemas.microsoft.com/office/drawing/2014/chartex" xmlns:cx1="http://schemas.microsoft.com/office/drawing/2015/9/8/chartex" xmlns:cx2="http://schemas.microsoft.com/office/drawing/2015/10/21/chartex" xmlns:cx3="http://schemas.microsoft.com/office/drawing/2016/5/9/chartex" xmlns:cx4="http://schemas.microsoft.com/office/drawing/2016/5/10/chartex" xmlns:cx5="http://schemas.microsoft.com/office/drawing/2016/5/11/chartex" xmlns:cx6="http://schemas.microsoft.com/office/drawing/2016/5/12/chartex" xmlns:cx7="http://schemas.microsoft.com/office/drawing/2016/5/13/chartex" xmlns:cx8="http://schemas.microsoft.com/office/drawing/2016/5/14/chartex" xmlns:mc="http://schemas.openxmlformats.org/markup-compatibility/2006" xmlns:m="http://schemas.openxmlformats.org/officeDocument/2006/math" xmlns:aink="http://schemas.microsoft.com/office/drawing/2016/ink" xmlns:am3d="http://schemas.microsoft.com/office/drawing/2017/model3d" xmlns:oel="http://schemas.microsoft.com/office/2019/extlst" xmlns:r="http://schemas.openxmlformats.org/officeDocument/2006/relationships" xmlns:wp14="http://schemas.microsoft.com/office/word/2010/wordprocessingDrawing" xmlns:wp="http://schemas.openxmlformats.org/drawingml/2006/wordprocessingDrawing" xmlns:wpg="http://schemas.microsoft.com/office/word/2010/wordprocessingGroup" xmlns:wpi="http://schemas.microsoft.com/office/word/2010/wordprocessingInk" xmlns:wps="http://schemas.microsoft.com/office/word/2010/wordprocessingShape" xmlns:o="urn:schemas-microsoft-com:office:office" xmlns:v="urn:schemas-microsoft-com:vml" xmlns:w10="urn:schemas-microsoft-com:office:word" xmlns:w="http://schemas.openxmlformats.org/wordprocessingml/2006/main" xmlns:w14="http://schemas.microsoft.com/office/word/2010/wordml" xmlns:w15="http://schemas.microsoft.com/office/word/2012/wordml" xmlns:w16cei="http://schemas.microsoft.com/office/word/2026/wordml/cei" xmlns:w16cex="http://schemas.microsoft.com/office/word/2018/wordml/cex" xmlns:w16cid="http://schemas.microsoft.com/office/word/2016/wordml/cid" xmlns:w16="http://schemas.microsoft.com/office/word/2018/wordml" xmlns:w16sdtdh="http://schemas.microsoft.com/office/word/2020/wordml/sdtdatahash" xmlns:w16sdtfl="http://schemas.microsoft.com/office/word/2024/wordml/sdtformatlock" xmlns:w16se="http://schemas.microsoft.com/office/word/2015/wordml/symex" xmlns:w16du="http://schemas.microsoft.com/office/word/2023/wordml/word16du" xmlns:wne="http://schemas.microsoft.com/office/word/2006/wordml" mc:Ignorable="w14 w15 w16se w16cid w16 w16cex w16sdtdh w16sdtfl w16du wp14">
+<w:document xmlns:wpc="http://schemas.microsoft.com/office/word/2010/wordprocessingCanvas" xmlns:cx="http://schemas.microsoft.com/office/drawing/2014/chartex" xmlns:cx1="http://schemas.microsoft.com/office/drawing/2015/9/8/chartex" xmlns:cx2="http://schemas.microsoft.com/office/drawing/2015/10/21/chartex" xmlns:cx3="http://schemas.microsoft.com/office/drawing/2016/5/9/chartex" xmlns:cx4="http://schemas.microsoft.com/office/drawing/2016/5/10/chartex" xmlns:cx5="http://schemas.microsoft.com/office/drawing/2016/5/11/chartex" xmlns:cx6="http://schemas.microsoft.com/office/drawing/2016/5/12/chartex" xmlns:cx7="http://schemas.microsoft.com/office/drawing/2016/5/13/chartex" xmlns:cx8="http://schemas.microsoft.com/office/drawing/2016/5/14/chartex" xmlns:mc="http://schemas.openxmlformats.org/markup-compatibility/2006" xmlns:aink="http://schemas.microsoft.com/office/drawing/2016/ink" xmlns:am3d="http://schemas.microsoft.com/office/drawing/2017/model3d" xmlns:o="urn:schemas-microsoft-com:office:office" xmlns:oel="http://schemas.microsoft.com/office/2019/extlst" xmlns:r="http://schemas.openxmlformats.org/officeDocument/2006/relationships" xmlns:m="http://schemas.openxmlformats.org/officeDocument/2006/math" xmlns:v="urn:schemas-microsoft-com:vml" xmlns:wp14="http://schemas.microsoft.com/office/word/2010/wordprocessingDrawing" xmlns:wp="http://schemas.openxmlformats.org/drawingml/2006/wordprocessingDrawing" xmlns:w10="urn:schemas-microsoft-com:office:word" xmlns:w="http://schemas.openxmlformats.org/wordprocessingml/2006/main" xmlns:w14="http://schemas.microsoft.com/office/word/2010/wordml" xmlns:w15="http://schemas.microsoft.com/office/word/2012/wordml" xmlns:w16cei="http://schemas.microsoft.com/office/word/2026/wordml/cei" xmlns:w16cex="http://schemas.microsoft.com/office/word/2018/wordml/cex" xmlns:w16cid="http://schemas.microsoft.com/office/word/2016/wordml/cid" xmlns:w16="http://schemas.microsoft.com/office/word/2018/wordml" xmlns:w16du="http://schemas.microsoft.com/office/word/2023/wordml/word16du" xmlns:w16sdtdh="http://schemas.microsoft.com/office/word/2020/wordml/sdtdatahash" xmlns:w16sdtfl="http://schemas.microsoft.com/office/word/2024/wordml/sdtformatlock" xmlns:w16se="http://schemas.microsoft.com/office/word/2015/wordml/symex" xmlns:wpg="http://schemas.microsoft.com/office/word/2010/wordprocessingGroup" xmlns:wpi="http://schemas.microsoft.com/office/word/2010/wordprocessingInk" xmlns:wne="http://schemas.microsoft.com/office/word/2006/wordml" xmlns:wps="http://schemas.microsoft.com/office/word/2010/wordprocessingShape" mc:Ignorable="w14 w15 w16se w16cid w16 w16cex w16sdtdh w16sdtfl w16du wp14">
   <w:body>
     <w:p>
       <w:pPr>
@@ -22,7 +22,15 @@
         <w:pStyle w:val="Heading1"/>
       </w:pPr>
       <w:r>
-        <w:t xml:space="preserve">Why spring boot over </w:t>
+        <w:t xml:space="preserve">Why </w:t>
+      </w:r>
+      <w:proofErr w:type="gramStart"/>
+      <w:r>
+        <w:t>spring</w:t>
+      </w:r>
+      <w:proofErr w:type="gramEnd"/>
+      <w:r>
+        <w:t xml:space="preserve"> boot over </w:t>
       </w:r>
       <w:proofErr w:type="gramStart"/>
       <w:r>
@@ -879,7 +887,28 @@
           <w:b/>
           <w:bCs/>
         </w:rPr>
-        <w:t>, properties, and existing beans</w:t>
+        <w:t xml:space="preserve">, properties, and existing </w:t>
+      </w:r>
+      <w:r>
+        <w:rPr>
+          <w:b/>
+          <w:bCs/>
+        </w:rPr>
+        <w:t>(custom)</w:t>
+      </w:r>
+      <w:r>
+        <w:rPr>
+          <w:b/>
+          <w:bCs/>
+        </w:rPr>
+        <w:t xml:space="preserve"> </w:t>
+      </w:r>
+      <w:r>
+        <w:rPr>
+          <w:b/>
+          <w:bCs/>
+        </w:rPr>
+        <w:t>beans</w:t>
       </w:r>
       <w:r>
         <w:rPr>
@@ -1862,6 +1891,7 @@
         <w:t xml:space="preserve">] </w:t>
       </w:r>
       <w:proofErr w:type="spellStart"/>
+      <w:proofErr w:type="gramStart"/>
       <w:r>
         <w:rPr>
           <w:rFonts w:ascii="Source Code Pro" w:hAnsi="Source Code Pro"/>
@@ -1877,6 +1907,7 @@
         </w:rPr>
         <w:t>) {</w:t>
       </w:r>
+      <w:proofErr w:type="gramEnd"/>
     </w:p>
     <w:p>
       <w:pPr>
@@ -2101,7 +2132,33 @@
           <w:lang w:val="en-US"/>
           <w14:ligatures w14:val="none"/>
         </w:rPr>
-        <w:t xml:space="preserve">If I have n beans in Spring Boot </w:t>
+        <w:t xml:space="preserve">If I have </w:t>
+      </w:r>
+      <w:proofErr w:type="gramStart"/>
+      <w:r>
+        <w:rPr>
+          <w:rFonts w:eastAsia="Times New Roman" w:cs="Times New Roman"/>
+          <w:b/>
+          <w:bCs/>
+          <w:kern w:val="0"/>
+          <w:sz w:val="24"/>
+          <w:lang w:val="en-US"/>
+          <w14:ligatures w14:val="none"/>
+        </w:rPr>
+        <w:t>n beans</w:t>
+      </w:r>
+      <w:proofErr w:type="gramEnd"/>
+      <w:r>
+        <w:rPr>
+          <w:rFonts w:eastAsia="Times New Roman" w:cs="Times New Roman"/>
+          <w:b/>
+          <w:bCs/>
+          <w:kern w:val="0"/>
+          <w:sz w:val="24"/>
+          <w:lang w:val="en-US"/>
+          <w14:ligatures w14:val="none"/>
+        </w:rPr>
+        <w:t xml:space="preserve"> in Spring Boot </w:t>
       </w:r>
       <w:proofErr w:type="gramStart"/>
       <w:r>
@@ -2512,6 +2569,7 @@
                 <w14:ligatures w14:val="none"/>
               </w:rPr>
             </w:pPr>
+            <w:proofErr w:type="gramStart"/>
             <w:r>
               <w:rPr>
                 <w:rFonts w:eastAsia="Times New Roman" w:cs="Times New Roman"/>
@@ -2520,7 +2578,18 @@
                 <w:lang w:val="en-US"/>
                 <w14:ligatures w14:val="none"/>
               </w:rPr>
-              <w:t xml:space="preserve">@Order, Ordered </w:t>
+              <w:t>@Order</w:t>
+            </w:r>
+            <w:proofErr w:type="gramEnd"/>
+            <w:r>
+              <w:rPr>
+                <w:rFonts w:eastAsia="Times New Roman" w:cs="Times New Roman"/>
+                <w:kern w:val="0"/>
+                <w:sz w:val="24"/>
+                <w:lang w:val="en-US"/>
+                <w14:ligatures w14:val="none"/>
+              </w:rPr>
+              <w:t xml:space="preserve">, Ordered </w:t>
             </w:r>
             <w:proofErr w:type="gramStart"/>
             <w:r>
@@ -2742,18 +2811,16 @@
         </w:rPr>
         <w:t xml:space="preserve"> is the central "Front Controller" of the Spring MVC framework. It acts as the </w:t>
       </w:r>
-      <w:proofErr w:type="gramStart"/>
-      <w:r>
-        <w:rPr>
-          <w:rFonts w:eastAsia="Times New Roman" w:cs="Times New Roman"/>
-          <w:kern w:val="0"/>
-          <w:szCs w:val="28"/>
-          <w:lang w:val="en-US"/>
-          <w14:ligatures w14:val="none"/>
-        </w:rPr>
-        <w:t>single entry</w:t>
-      </w:r>
-      <w:proofErr w:type="gramEnd"/>
+      <w:r>
+        <w:rPr>
+          <w:rFonts w:eastAsia="Times New Roman" w:cs="Times New Roman"/>
+          <w:kern w:val="0"/>
+          <w:szCs w:val="28"/>
+          <w:lang w:val="en-US"/>
+          <w14:ligatures w14:val="none"/>
+        </w:rPr>
+        <w:t>single-entry</w:t>
+      </w:r>
       <w:r>
         <w:rPr>
           <w:rFonts w:eastAsia="Times New Roman" w:cs="Times New Roman"/>
@@ -5446,6 +5513,7 @@
           <w:lang w:val="en-US"/>
           <w14:ligatures w14:val="none"/>
         </w:rPr>
+        <w:lastRenderedPageBreak/>
         <w:t> </w:t>
       </w:r>
     </w:p>
@@ -5462,7 +5530,6 @@
           <w:rFonts w:eastAsia="Times New Roman"/>
           <w:lang w:val="en-US"/>
         </w:rPr>
-        <w:lastRenderedPageBreak/>
         <w:t>1)</w:t>
       </w:r>
       <w:proofErr w:type="spellStart"/>
@@ -6241,6 +6308,7 @@
           <w:b/>
           <w:bCs/>
         </w:rPr>
+        <w:lastRenderedPageBreak/>
         <w:t>BeanFactory</w:t>
       </w:r>
       <w:proofErr w:type="spellEnd"/>
@@ -6261,7 +6329,6 @@
         <w:spacing w:line="278" w:lineRule="auto"/>
       </w:pPr>
       <w:r>
-        <w:lastRenderedPageBreak/>
         <w:t xml:space="preserve">Lazy initialization (creates bean only when needed) </w:t>
       </w:r>
     </w:p>
@@ -6562,13 +6629,13 @@
       </w:r>
       <w:r>
         <w:br/>
+      </w:r>
+      <w:r>
+        <w:lastRenderedPageBreak/>
         <w:t xml:space="preserve">    @Override</w:t>
       </w:r>
       <w:r>
         <w:br/>
-      </w:r>
-      <w:r>
-        <w:lastRenderedPageBreak/>
         <w:t xml:space="preserve">    </w:t>
       </w:r>
       <w:r>
@@ -6887,13 +6954,29 @@
           <w:bCs/>
           <w:lang w:val="en-US"/>
         </w:rPr>
-        <w:t>query parameter</w:t>
-      </w:r>
-      <w:r>
-        <w:rPr>
-          <w:lang w:val="en-US"/>
-        </w:rPr>
-        <w:t xml:space="preserve"> is part of the URL </w:t>
+        <w:t xml:space="preserve">query </w:t>
+      </w:r>
+      <w:proofErr w:type="gramStart"/>
+      <w:r>
+        <w:rPr>
+          <w:b/>
+          <w:bCs/>
+          <w:lang w:val="en-US"/>
+        </w:rPr>
+        <w:t>parameter</w:t>
+      </w:r>
+      <w:r>
+        <w:rPr>
+          <w:lang w:val="en-US"/>
+        </w:rPr>
+        <w:t xml:space="preserve"> is</w:t>
+      </w:r>
+      <w:proofErr w:type="gramEnd"/>
+      <w:r>
+        <w:rPr>
+          <w:lang w:val="en-US"/>
+        </w:rPr>
+        <w:t xml:space="preserve"> part of the URL </w:t>
       </w:r>
       <w:proofErr w:type="gramStart"/>
       <w:r>
@@ -7048,11 +7131,20 @@
           <w:lang w:val="en-US"/>
         </w:rPr>
       </w:pPr>
-      <w:r>
-        <w:rPr>
-          <w:lang w:val="en-US"/>
-        </w:rPr>
-        <w:t>@GetMapping("/users")</w:t>
+      <w:proofErr w:type="gramStart"/>
+      <w:r>
+        <w:rPr>
+          <w:lang w:val="en-US"/>
+        </w:rPr>
+        <w:lastRenderedPageBreak/>
+        <w:t>@GetMapping</w:t>
+      </w:r>
+      <w:proofErr w:type="gramEnd"/>
+      <w:r>
+        <w:rPr>
+          <w:lang w:val="en-US"/>
+        </w:rPr>
+        <w:t>("/users")</w:t>
       </w:r>
       <w:r>
         <w:rPr>
@@ -7095,12 +7187,6 @@
           <w:lang w:val="en-US"/>
         </w:rPr>
         <w:br/>
-      </w:r>
-      <w:r>
-        <w:rPr>
-          <w:lang w:val="en-US"/>
-        </w:rPr>
-        <w:lastRenderedPageBreak/>
         <w:t xml:space="preserve">    @RequestParam int page,</w:t>
       </w:r>
       <w:r>
@@ -11276,31 +11362,12 @@
         <w:rPr>
           <w:rFonts w:eastAsia="Times New Roman"/>
         </w:rPr>
-        <w:t>OAuth2</w:t>
-      </w:r>
-    </w:p>
-    <w:p>
-      <w:pPr>
-        <w:spacing w:after="0" w:line="240" w:lineRule="auto"/>
-        <w:rPr>
-          <w:rFonts w:eastAsia="Times New Roman" w:cs="Times New Roman"/>
-          <w:kern w:val="0"/>
-          <w:sz w:val="24"/>
-          <w:lang w:val="en-US"/>
-          <w14:ligatures w14:val="none"/>
-        </w:rPr>
-      </w:pPr>
-      <w:r>
-        <w:rPr>
-          <w:rFonts w:eastAsia="Times New Roman" w:cs="Times New Roman"/>
-          <w:kern w:val="0"/>
-          <w:sz w:val="24"/>
-          <w:lang w:val="en-US"/>
-          <w14:ligatures w14:val="none"/>
-        </w:rPr>
-        <w:t xml:space="preserve">A framework for </w:t>
-      </w:r>
-      <w:r>
+        <w:t>OAuth</w:t>
+      </w:r>
+    </w:p>
+    <w:p>
+      <w:pPr>
+        <w:spacing w:after="0" w:line="240" w:lineRule="auto"/>
         <w:rPr>
           <w:rFonts w:eastAsia="Times New Roman" w:cs="Times New Roman"/>
           <w:b/>
@@ -11310,51 +11377,1017 @@
           <w:lang w:val="en-US"/>
           <w14:ligatures w14:val="none"/>
         </w:rPr>
+      </w:pPr>
+      <w:r>
+        <w:rPr>
+          <w:rFonts w:eastAsia="Times New Roman" w:cs="Times New Roman"/>
+          <w:kern w:val="0"/>
+          <w:sz w:val="24"/>
+          <w:lang w:val="en-US"/>
+          <w14:ligatures w14:val="none"/>
+        </w:rPr>
+        <w:t>It is a</w:t>
+      </w:r>
+      <w:r>
+        <w:rPr>
+          <w:rFonts w:eastAsia="Times New Roman" w:cs="Times New Roman"/>
+          <w:kern w:val="0"/>
+          <w:sz w:val="24"/>
+          <w:lang w:val="en-US"/>
+          <w14:ligatures w14:val="none"/>
+        </w:rPr>
+        <w:t xml:space="preserve"> framework for </w:t>
+      </w:r>
+      <w:r>
+        <w:rPr>
+          <w:rFonts w:eastAsia="Times New Roman" w:cs="Times New Roman"/>
+          <w:b/>
+          <w:bCs/>
+          <w:kern w:val="0"/>
+          <w:sz w:val="24"/>
+          <w:lang w:val="en-US"/>
+          <w14:ligatures w14:val="none"/>
+        </w:rPr>
         <w:t>delegated authorization</w:t>
       </w:r>
-    </w:p>
-    <w:p>
-      <w:pPr>
-        <w:spacing w:after="0" w:line="240" w:lineRule="auto"/>
-        <w:rPr>
-          <w:rFonts w:eastAsia="Times New Roman" w:cs="Times New Roman"/>
-          <w:kern w:val="0"/>
-          <w:sz w:val="24"/>
-          <w:lang w:val="en-US"/>
-          <w14:ligatures w14:val="none"/>
-        </w:rPr>
-      </w:pPr>
-      <w:r>
-        <w:rPr>
-          <w:rFonts w:eastAsia="Times New Roman" w:cs="Times New Roman"/>
-          <w:kern w:val="0"/>
-          <w:sz w:val="24"/>
-          <w:lang w:val="en-US"/>
-          <w14:ligatures w14:val="none"/>
-        </w:rPr>
-        <w:t> </w:t>
-      </w:r>
-    </w:p>
-    <w:p>
-      <w:pPr>
-        <w:spacing w:after="0" w:line="240" w:lineRule="auto"/>
-        <w:rPr>
-          <w:rFonts w:eastAsia="Times New Roman" w:cs="Times New Roman"/>
-          <w:kern w:val="0"/>
-          <w:sz w:val="24"/>
-          <w:lang w:val="en-US"/>
-          <w14:ligatures w14:val="none"/>
-        </w:rPr>
-      </w:pPr>
-      <w:r>
-        <w:rPr>
-          <w:rFonts w:eastAsia="Times New Roman" w:cs="Times New Roman"/>
-          <w:kern w:val="0"/>
-          <w:sz w:val="24"/>
-          <w:lang w:val="en-US"/>
-          <w14:ligatures w14:val="none"/>
-        </w:rPr>
-        <w:t>OAuth2 is an authorization framework often using tokens like JWT to grant access to resources.</w:t>
+      <w:r>
+        <w:rPr>
+          <w:rFonts w:eastAsia="Times New Roman" w:cs="Times New Roman"/>
+          <w:b/>
+          <w:bCs/>
+          <w:kern w:val="0"/>
+          <w:sz w:val="24"/>
+          <w:lang w:val="en-US"/>
+          <w14:ligatures w14:val="none"/>
+        </w:rPr>
+        <w:t>.</w:t>
+      </w:r>
+    </w:p>
+    <w:p>
+      <w:pPr>
+        <w:spacing w:after="0" w:line="240" w:lineRule="auto"/>
+        <w:rPr>
+          <w:rFonts w:eastAsia="Times New Roman" w:cs="Times New Roman"/>
+          <w:b/>
+          <w:bCs/>
+          <w:kern w:val="0"/>
+          <w:sz w:val="24"/>
+          <w:lang w:val="en-US"/>
+          <w14:ligatures w14:val="none"/>
+        </w:rPr>
+      </w:pPr>
+    </w:p>
+    <w:p>
+      <w:pPr>
+        <w:spacing w:after="0" w:line="300" w:lineRule="atLeast"/>
+        <w:rPr>
+          <w:rFonts w:eastAsia="Times New Roman" w:cs="Segoe UI"/>
+          <w:kern w:val="0"/>
+          <w:sz w:val="24"/>
+          <w:lang w:eastAsia="en-IN"/>
+          <w14:ligatures w14:val="none"/>
+        </w:rPr>
+      </w:pPr>
+      <w:r>
+        <w:rPr>
+          <w:rFonts w:eastAsia="Times New Roman" w:cs="Segoe UI"/>
+          <w:b/>
+          <w:bCs/>
+          <w:kern w:val="0"/>
+          <w:sz w:val="24"/>
+          <w:lang w:eastAsia="en-IN"/>
+          <w14:ligatures w14:val="none"/>
+        </w:rPr>
+        <w:t>OAuth (Open Authorization)</w:t>
+      </w:r>
+      <w:r>
+        <w:rPr>
+          <w:rFonts w:eastAsia="Times New Roman" w:cs="Segoe UI"/>
+          <w:kern w:val="0"/>
+          <w:sz w:val="24"/>
+          <w:lang w:eastAsia="en-IN"/>
+          <w14:ligatures w14:val="none"/>
+        </w:rPr>
+        <w:t xml:space="preserve"> is a standard that allows an application to access a user's resources </w:t>
+      </w:r>
+      <w:r>
+        <w:rPr>
+          <w:rFonts w:eastAsia="Times New Roman" w:cs="Segoe UI"/>
+          <w:b/>
+          <w:bCs/>
+          <w:kern w:val="0"/>
+          <w:sz w:val="24"/>
+          <w:lang w:eastAsia="en-IN"/>
+          <w14:ligatures w14:val="none"/>
+        </w:rPr>
+        <w:t>without sharing the user's password</w:t>
+      </w:r>
+      <w:r>
+        <w:rPr>
+          <w:rFonts w:eastAsia="Times New Roman" w:cs="Segoe UI"/>
+          <w:kern w:val="0"/>
+          <w:sz w:val="24"/>
+          <w:lang w:eastAsia="en-IN"/>
+          <w14:ligatures w14:val="none"/>
+        </w:rPr>
+        <w:t>.</w:t>
+      </w:r>
+    </w:p>
+    <w:p>
+      <w:pPr>
+        <w:rPr>
+          <w:lang w:val="en-US"/>
+        </w:rPr>
+      </w:pPr>
+    </w:p>
+    <w:p>
+      <w:pPr>
+        <w:spacing w:after="0" w:line="240" w:lineRule="auto"/>
+        <w:rPr>
+          <w:rFonts w:eastAsia="Times New Roman" w:cs="Times New Roman"/>
+          <w:b/>
+          <w:bCs/>
+          <w:kern w:val="0"/>
+          <w:sz w:val="24"/>
+          <w14:ligatures w14:val="none"/>
+        </w:rPr>
+      </w:pPr>
+      <w:r>
+        <w:rPr>
+          <w:rFonts w:eastAsia="Times New Roman" w:cs="Times New Roman"/>
+          <w:b/>
+          <w:bCs/>
+          <w:kern w:val="0"/>
+          <w:sz w:val="24"/>
+          <w14:ligatures w14:val="none"/>
+        </w:rPr>
+        <w:t>Real-Time Example</w:t>
+      </w:r>
+    </w:p>
+    <w:p>
+      <w:pPr>
+        <w:spacing w:after="0" w:line="240" w:lineRule="auto"/>
+        <w:rPr>
+          <w:rFonts w:eastAsia="Times New Roman" w:cs="Times New Roman"/>
+          <w:kern w:val="0"/>
+          <w:sz w:val="24"/>
+          <w14:ligatures w14:val="none"/>
+        </w:rPr>
+      </w:pPr>
+      <w:r>
+        <w:rPr>
+          <w:rFonts w:eastAsia="Times New Roman" w:cs="Times New Roman"/>
+          <w:b/>
+          <w:bCs/>
+          <w:kern w:val="0"/>
+          <w:sz w:val="24"/>
+          <w14:ligatures w14:val="none"/>
+        </w:rPr>
+        <w:t>"Login with Google"</w:t>
+      </w:r>
+      <w:r>
+        <w:rPr>
+          <w:rFonts w:eastAsia="Times New Roman" w:cs="Times New Roman"/>
+          <w:kern w:val="0"/>
+          <w:sz w:val="24"/>
+          <w14:ligatures w14:val="none"/>
+        </w:rPr>
+        <w:t xml:space="preserve"> on a </w:t>
+      </w:r>
+      <w:proofErr w:type="gramStart"/>
+      <w:r>
+        <w:rPr>
+          <w:rFonts w:eastAsia="Times New Roman" w:cs="Times New Roman"/>
+          <w:kern w:val="0"/>
+          <w:sz w:val="24"/>
+          <w14:ligatures w14:val="none"/>
+        </w:rPr>
+        <w:t>website.</w:t>
+      </w:r>
+      <w:r>
+        <w:rPr>
+          <w:rFonts w:eastAsia="Times New Roman" w:cs="Times New Roman"/>
+          <w:kern w:val="0"/>
+          <w:sz w:val="24"/>
+          <w14:ligatures w14:val="none"/>
+        </w:rPr>
+        <w:t>(</w:t>
+      </w:r>
+      <w:proofErr w:type="gramEnd"/>
+      <w:r>
+        <w:rPr>
+          <w:rFonts w:eastAsia="Times New Roman" w:cs="Times New Roman"/>
+          <w:kern w:val="0"/>
+          <w:sz w:val="24"/>
+          <w14:ligatures w14:val="none"/>
+        </w:rPr>
+        <w:t xml:space="preserve"> like</w:t>
+      </w:r>
+      <w:r>
+        <w:rPr>
+          <w:rFonts w:eastAsia="Times New Roman" w:cs="Times New Roman"/>
+          <w:kern w:val="0"/>
+          <w:sz w:val="24"/>
+          <w14:ligatures w14:val="none"/>
+        </w:rPr>
+        <w:t xml:space="preserve"> </w:t>
+      </w:r>
+      <w:r>
+        <w:rPr>
+          <w:rFonts w:eastAsia="Times New Roman" w:cs="Times New Roman"/>
+          <w:kern w:val="0"/>
+          <w:sz w:val="24"/>
+          <w14:ligatures w14:val="none"/>
+        </w:rPr>
+        <w:t xml:space="preserve">LinkedIn / </w:t>
+      </w:r>
+      <w:proofErr w:type="gramStart"/>
+      <w:r>
+        <w:rPr>
+          <w:rFonts w:eastAsia="Times New Roman" w:cs="Times New Roman"/>
+          <w:kern w:val="0"/>
+          <w:sz w:val="24"/>
+          <w14:ligatures w14:val="none"/>
+        </w:rPr>
+        <w:t>Spotify )</w:t>
+      </w:r>
+      <w:proofErr w:type="gramEnd"/>
+    </w:p>
+    <w:p>
+      <w:pPr>
+        <w:numPr>
+          <w:ilvl w:val="0"/>
+          <w:numId w:val="52"/>
+        </w:numPr>
+        <w:spacing w:after="0" w:line="240" w:lineRule="auto"/>
+        <w:rPr>
+          <w:rFonts w:eastAsia="Times New Roman" w:cs="Times New Roman"/>
+          <w:kern w:val="0"/>
+          <w:sz w:val="24"/>
+          <w14:ligatures w14:val="none"/>
+        </w:rPr>
+      </w:pPr>
+      <w:r>
+        <w:rPr>
+          <w:rFonts w:eastAsia="Times New Roman" w:cs="Times New Roman"/>
+          <w:kern w:val="0"/>
+          <w:sz w:val="24"/>
+          <w14:ligatures w14:val="none"/>
+        </w:rPr>
+        <w:t xml:space="preserve">User clicks </w:t>
+      </w:r>
+      <w:r>
+        <w:rPr>
+          <w:rFonts w:eastAsia="Times New Roman" w:cs="Times New Roman"/>
+          <w:b/>
+          <w:bCs/>
+          <w:kern w:val="0"/>
+          <w:sz w:val="24"/>
+          <w14:ligatures w14:val="none"/>
+        </w:rPr>
+        <w:t>Login with Google</w:t>
+      </w:r>
+      <w:r>
+        <w:rPr>
+          <w:rFonts w:eastAsia="Times New Roman" w:cs="Times New Roman"/>
+          <w:kern w:val="0"/>
+          <w:sz w:val="24"/>
+          <w14:ligatures w14:val="none"/>
+        </w:rPr>
+        <w:t>.</w:t>
+      </w:r>
+    </w:p>
+    <w:p>
+      <w:pPr>
+        <w:numPr>
+          <w:ilvl w:val="0"/>
+          <w:numId w:val="52"/>
+        </w:numPr>
+        <w:spacing w:after="0" w:line="240" w:lineRule="auto"/>
+        <w:rPr>
+          <w:rFonts w:eastAsia="Times New Roman" w:cs="Times New Roman"/>
+          <w:kern w:val="0"/>
+          <w:sz w:val="24"/>
+          <w14:ligatures w14:val="none"/>
+        </w:rPr>
+      </w:pPr>
+      <w:r>
+        <w:rPr>
+          <w:rFonts w:eastAsia="Times New Roman" w:cs="Times New Roman"/>
+          <w:kern w:val="0"/>
+          <w:sz w:val="24"/>
+          <w14:ligatures w14:val="none"/>
+        </w:rPr>
+        <w:t xml:space="preserve">Website redirects user to </w:t>
+      </w:r>
+      <w:r>
+        <w:rPr>
+          <w:rFonts w:eastAsia="Times New Roman" w:cs="Times New Roman"/>
+          <w:b/>
+          <w:bCs/>
+          <w:kern w:val="0"/>
+          <w:sz w:val="24"/>
+          <w14:ligatures w14:val="none"/>
+        </w:rPr>
+        <w:t>Google</w:t>
+      </w:r>
+      <w:r>
+        <w:rPr>
+          <w:rFonts w:eastAsia="Times New Roman" w:cs="Times New Roman"/>
+          <w:kern w:val="0"/>
+          <w:sz w:val="24"/>
+          <w14:ligatures w14:val="none"/>
+        </w:rPr>
+        <w:t>.</w:t>
+      </w:r>
+    </w:p>
+    <w:p>
+      <w:pPr>
+        <w:numPr>
+          <w:ilvl w:val="0"/>
+          <w:numId w:val="52"/>
+        </w:numPr>
+        <w:spacing w:after="0" w:line="240" w:lineRule="auto"/>
+        <w:rPr>
+          <w:rFonts w:eastAsia="Times New Roman" w:cs="Times New Roman"/>
+          <w:kern w:val="0"/>
+          <w:sz w:val="24"/>
+          <w14:ligatures w14:val="none"/>
+        </w:rPr>
+      </w:pPr>
+      <w:r>
+        <w:rPr>
+          <w:rFonts w:eastAsia="Times New Roman" w:cs="Times New Roman"/>
+          <w:kern w:val="0"/>
+          <w:sz w:val="24"/>
+          <w14:ligatures w14:val="none"/>
+        </w:rPr>
+        <w:t>User authenticates with Google.</w:t>
+      </w:r>
+    </w:p>
+    <w:p>
+      <w:pPr>
+        <w:numPr>
+          <w:ilvl w:val="0"/>
+          <w:numId w:val="52"/>
+        </w:numPr>
+        <w:spacing w:after="0" w:line="240" w:lineRule="auto"/>
+        <w:rPr>
+          <w:rFonts w:eastAsia="Times New Roman" w:cs="Times New Roman"/>
+          <w:kern w:val="0"/>
+          <w:sz w:val="24"/>
+          <w14:ligatures w14:val="none"/>
+        </w:rPr>
+      </w:pPr>
+      <w:r>
+        <w:rPr>
+          <w:rFonts w:eastAsia="Times New Roman" w:cs="Times New Roman"/>
+          <w:kern w:val="0"/>
+          <w:sz w:val="24"/>
+          <w14:ligatures w14:val="none"/>
+        </w:rPr>
+        <w:t xml:space="preserve">Google asks: </w:t>
+      </w:r>
+      <w:r>
+        <w:rPr>
+          <w:rFonts w:eastAsia="Times New Roman" w:cs="Times New Roman"/>
+          <w:i/>
+          <w:iCs/>
+          <w:kern w:val="0"/>
+          <w:sz w:val="24"/>
+          <w14:ligatures w14:val="none"/>
+        </w:rPr>
+        <w:t>"Allow this app to access your profile?"</w:t>
+      </w:r>
+    </w:p>
+    <w:p>
+      <w:pPr>
+        <w:numPr>
+          <w:ilvl w:val="0"/>
+          <w:numId w:val="52"/>
+        </w:numPr>
+        <w:spacing w:after="0" w:line="240" w:lineRule="auto"/>
+        <w:rPr>
+          <w:rFonts w:eastAsia="Times New Roman" w:cs="Times New Roman"/>
+          <w:kern w:val="0"/>
+          <w:sz w:val="24"/>
+          <w14:ligatures w14:val="none"/>
+        </w:rPr>
+      </w:pPr>
+      <w:r>
+        <w:rPr>
+          <w:rFonts w:eastAsia="Times New Roman" w:cs="Times New Roman"/>
+          <w:kern w:val="0"/>
+          <w:sz w:val="24"/>
+          <w14:ligatures w14:val="none"/>
+        </w:rPr>
+        <w:t xml:space="preserve">If approved, Google issues an </w:t>
+      </w:r>
+      <w:r>
+        <w:rPr>
+          <w:rFonts w:eastAsia="Times New Roman" w:cs="Times New Roman"/>
+          <w:b/>
+          <w:bCs/>
+          <w:kern w:val="0"/>
+          <w:sz w:val="24"/>
+          <w14:ligatures w14:val="none"/>
+        </w:rPr>
+        <w:t>Access Token</w:t>
+      </w:r>
+      <w:r>
+        <w:rPr>
+          <w:rFonts w:eastAsia="Times New Roman" w:cs="Times New Roman"/>
+          <w:kern w:val="0"/>
+          <w:sz w:val="24"/>
+          <w14:ligatures w14:val="none"/>
+        </w:rPr>
+        <w:t xml:space="preserve"> to the website.</w:t>
+      </w:r>
+    </w:p>
+    <w:p>
+      <w:pPr>
+        <w:numPr>
+          <w:ilvl w:val="0"/>
+          <w:numId w:val="52"/>
+        </w:numPr>
+        <w:spacing w:after="0" w:line="240" w:lineRule="auto"/>
+        <w:rPr>
+          <w:rFonts w:eastAsia="Times New Roman" w:cs="Times New Roman"/>
+          <w:kern w:val="0"/>
+          <w:sz w:val="24"/>
+          <w14:ligatures w14:val="none"/>
+        </w:rPr>
+      </w:pPr>
+      <w:r>
+        <w:rPr>
+          <w:rFonts w:eastAsia="Times New Roman" w:cs="Times New Roman"/>
+          <w:kern w:val="0"/>
+          <w:sz w:val="24"/>
+          <w14:ligatures w14:val="none"/>
+        </w:rPr>
+        <w:t>The website uses the token to access the allowed user information.</w:t>
+      </w:r>
+      <w:r>
+        <w:rPr>
+          <w:rFonts w:eastAsia="Times New Roman" w:cs="Times New Roman"/>
+          <w:kern w:val="0"/>
+          <w:sz w:val="24"/>
+          <w14:ligatures w14:val="none"/>
+        </w:rPr>
+        <w:t>(</w:t>
+      </w:r>
+      <w:r>
+        <w:rPr>
+          <w:rFonts w:ascii="Segoe UI" w:eastAsia="Times New Roman" w:hAnsi="Segoe UI" w:cs="Segoe UI"/>
+          <w:kern w:val="0"/>
+          <w:sz w:val="21"/>
+          <w:szCs w:val="21"/>
+          <w:lang w:eastAsia="en-IN"/>
+          <w14:ligatures w14:val="none"/>
+        </w:rPr>
+        <w:t xml:space="preserve"> </w:t>
+      </w:r>
+      <w:r>
+        <w:rPr>
+          <w:rFonts w:eastAsia="Times New Roman" w:cs="Times New Roman"/>
+          <w:kern w:val="0"/>
+          <w:sz w:val="24"/>
+          <w14:ligatures w14:val="none"/>
+        </w:rPr>
+        <w:t>Google APIs (Profile</w:t>
+      </w:r>
+      <w:r>
+        <w:rPr>
+          <w:rFonts w:eastAsia="Times New Roman" w:cs="Times New Roman"/>
+          <w:kern w:val="0"/>
+          <w:sz w:val="24"/>
+          <w14:ligatures w14:val="none"/>
+        </w:rPr>
+        <w:t xml:space="preserve"> </w:t>
+      </w:r>
+      <w:proofErr w:type="gramStart"/>
+      <w:r>
+        <w:rPr>
+          <w:rFonts w:eastAsia="Times New Roman" w:cs="Times New Roman"/>
+          <w:kern w:val="0"/>
+          <w:sz w:val="24"/>
+          <w14:ligatures w14:val="none"/>
+        </w:rPr>
+        <w:t xml:space="preserve">Name </w:t>
+      </w:r>
+      <w:r>
+        <w:rPr>
+          <w:rFonts w:eastAsia="Times New Roman" w:cs="Times New Roman"/>
+          <w:kern w:val="0"/>
+          <w:sz w:val="24"/>
+          <w14:ligatures w14:val="none"/>
+        </w:rPr>
+        <w:t>,</w:t>
+      </w:r>
+      <w:proofErr w:type="gramEnd"/>
+      <w:r>
+        <w:rPr>
+          <w:rFonts w:eastAsia="Times New Roman" w:cs="Times New Roman"/>
+          <w:kern w:val="0"/>
+          <w:sz w:val="24"/>
+          <w14:ligatures w14:val="none"/>
+        </w:rPr>
+        <w:t xml:space="preserve"> Email, etc.)</w:t>
+      </w:r>
+    </w:p>
+    <w:p>
+      <w:pPr>
+        <w:spacing w:after="0" w:line="240" w:lineRule="auto"/>
+        <w:rPr>
+          <w:rFonts w:eastAsia="Times New Roman" w:cs="Times New Roman"/>
+          <w:kern w:val="0"/>
+          <w:sz w:val="24"/>
+          <w14:ligatures w14:val="none"/>
+        </w:rPr>
+      </w:pPr>
+    </w:p>
+    <w:p>
+      <w:pPr>
+        <w:spacing w:after="0" w:line="240" w:lineRule="auto"/>
+        <w:rPr>
+          <w:rFonts w:eastAsia="Times New Roman" w:cs="Times New Roman"/>
+          <w:kern w:val="0"/>
+          <w:sz w:val="24"/>
+          <w14:ligatures w14:val="none"/>
+        </w:rPr>
+      </w:pPr>
+    </w:p>
+    <w:p>
+      <w:pPr>
+        <w:spacing w:after="0" w:line="240" w:lineRule="auto"/>
+        <w:rPr>
+          <w:rFonts w:eastAsia="Times New Roman" w:cs="Times New Roman"/>
+          <w:kern w:val="0"/>
+          <w:sz w:val="24"/>
+          <w14:ligatures w14:val="none"/>
+        </w:rPr>
+      </w:pPr>
+      <w:r>
+        <w:rPr>
+          <w:rFonts w:ascii="Segoe UI Emoji" w:eastAsia="Times New Roman" w:hAnsi="Segoe UI Emoji" w:cs="Segoe UI Emoji"/>
+          <w:kern w:val="0"/>
+          <w:sz w:val="24"/>
+          <w14:ligatures w14:val="none"/>
+        </w:rPr>
+        <w:t>✅</w:t>
+      </w:r>
+      <w:r>
+        <w:rPr>
+          <w:rFonts w:eastAsia="Times New Roman" w:cs="Times New Roman"/>
+          <w:kern w:val="0"/>
+          <w:sz w:val="24"/>
+          <w14:ligatures w14:val="none"/>
+        </w:rPr>
+        <w:t xml:space="preserve"> User never shares the Google password with the website.</w:t>
+      </w:r>
+    </w:p>
+    <w:p>
+      <w:pPr>
+        <w:spacing w:after="0" w:line="240" w:lineRule="auto"/>
+        <w:rPr>
+          <w:rFonts w:eastAsia="Times New Roman" w:cs="Times New Roman"/>
+          <w:kern w:val="0"/>
+          <w:sz w:val="24"/>
+          <w14:ligatures w14:val="none"/>
+        </w:rPr>
+      </w:pPr>
+    </w:p>
+    <w:p>
+      <w:pPr>
+        <w:spacing w:after="0" w:line="300" w:lineRule="atLeast"/>
+        <w:rPr>
+          <w:rFonts w:ascii="Segoe UI" w:eastAsia="Times New Roman" w:hAnsi="Segoe UI" w:cs="Segoe UI"/>
+          <w:kern w:val="0"/>
+          <w:sz w:val="21"/>
+          <w:szCs w:val="21"/>
+          <w:lang w:eastAsia="en-IN"/>
+          <w14:ligatures w14:val="none"/>
+        </w:rPr>
+      </w:pPr>
+      <w:proofErr w:type="gramStart"/>
+      <w:r>
+        <w:rPr>
+          <w:rFonts w:ascii="Segoe UI" w:eastAsia="Times New Roman" w:hAnsi="Symbol" w:cs="Segoe UI"/>
+          <w:kern w:val="0"/>
+          <w:sz w:val="21"/>
+          <w:szCs w:val="21"/>
+          <w:lang w:eastAsia="en-IN"/>
+          <w14:ligatures w14:val="none"/>
+        </w:rPr>
+        <w:t></w:t>
+      </w:r>
+      <w:r>
+        <w:rPr>
+          <w:rFonts w:ascii="Segoe UI" w:eastAsia="Times New Roman" w:hAnsi="Segoe UI" w:cs="Segoe UI"/>
+          <w:kern w:val="0"/>
+          <w:sz w:val="21"/>
+          <w:szCs w:val="21"/>
+          <w:lang w:eastAsia="en-IN"/>
+          <w14:ligatures w14:val="none"/>
+        </w:rPr>
+        <w:t xml:space="preserve">  </w:t>
+      </w:r>
+      <w:r>
+        <w:rPr>
+          <w:rFonts w:ascii="Segoe UI" w:eastAsia="Times New Roman" w:hAnsi="Segoe UI" w:cs="Segoe UI"/>
+          <w:b/>
+          <w:bCs/>
+          <w:kern w:val="0"/>
+          <w:sz w:val="21"/>
+          <w:szCs w:val="21"/>
+          <w:lang w:eastAsia="en-IN"/>
+          <w14:ligatures w14:val="none"/>
+        </w:rPr>
+        <w:t>Resource</w:t>
+      </w:r>
+      <w:proofErr w:type="gramEnd"/>
+      <w:r>
+        <w:rPr>
+          <w:rFonts w:ascii="Segoe UI" w:eastAsia="Times New Roman" w:hAnsi="Segoe UI" w:cs="Segoe UI"/>
+          <w:b/>
+          <w:bCs/>
+          <w:kern w:val="0"/>
+          <w:sz w:val="21"/>
+          <w:szCs w:val="21"/>
+          <w:lang w:eastAsia="en-IN"/>
+          <w14:ligatures w14:val="none"/>
+        </w:rPr>
+        <w:t xml:space="preserve"> Owner</w:t>
+      </w:r>
+      <w:r>
+        <w:rPr>
+          <w:rFonts w:ascii="Segoe UI" w:eastAsia="Times New Roman" w:hAnsi="Segoe UI" w:cs="Segoe UI"/>
+          <w:kern w:val="0"/>
+          <w:sz w:val="21"/>
+          <w:szCs w:val="21"/>
+          <w:lang w:eastAsia="en-IN"/>
+          <w14:ligatures w14:val="none"/>
+        </w:rPr>
+        <w:t xml:space="preserve"> → User </w:t>
+      </w:r>
+    </w:p>
+    <w:p>
+      <w:pPr>
+        <w:spacing w:after="0" w:line="300" w:lineRule="atLeast"/>
+        <w:rPr>
+          <w:rFonts w:ascii="Segoe UI" w:eastAsia="Times New Roman" w:hAnsi="Segoe UI" w:cs="Segoe UI"/>
+          <w:kern w:val="0"/>
+          <w:sz w:val="21"/>
+          <w:szCs w:val="21"/>
+          <w:lang w:eastAsia="en-IN"/>
+          <w14:ligatures w14:val="none"/>
+        </w:rPr>
+      </w:pPr>
+      <w:proofErr w:type="gramStart"/>
+      <w:r>
+        <w:rPr>
+          <w:rFonts w:ascii="Segoe UI" w:eastAsia="Times New Roman" w:hAnsi="Symbol" w:cs="Segoe UI"/>
+          <w:kern w:val="0"/>
+          <w:sz w:val="21"/>
+          <w:szCs w:val="21"/>
+          <w:lang w:eastAsia="en-IN"/>
+          <w14:ligatures w14:val="none"/>
+        </w:rPr>
+        <w:t></w:t>
+      </w:r>
+      <w:r>
+        <w:rPr>
+          <w:rFonts w:ascii="Segoe UI" w:eastAsia="Times New Roman" w:hAnsi="Segoe UI" w:cs="Segoe UI"/>
+          <w:kern w:val="0"/>
+          <w:sz w:val="21"/>
+          <w:szCs w:val="21"/>
+          <w:lang w:eastAsia="en-IN"/>
+          <w14:ligatures w14:val="none"/>
+        </w:rPr>
+        <w:t xml:space="preserve">  </w:t>
+      </w:r>
+      <w:r>
+        <w:rPr>
+          <w:rFonts w:ascii="Segoe UI" w:eastAsia="Times New Roman" w:hAnsi="Segoe UI" w:cs="Segoe UI"/>
+          <w:b/>
+          <w:bCs/>
+          <w:kern w:val="0"/>
+          <w:sz w:val="21"/>
+          <w:szCs w:val="21"/>
+          <w:lang w:eastAsia="en-IN"/>
+          <w14:ligatures w14:val="none"/>
+        </w:rPr>
+        <w:t>Client</w:t>
+      </w:r>
+      <w:proofErr w:type="gramEnd"/>
+      <w:r>
+        <w:rPr>
+          <w:rFonts w:ascii="Segoe UI" w:eastAsia="Times New Roman" w:hAnsi="Segoe UI" w:cs="Segoe UI"/>
+          <w:kern w:val="0"/>
+          <w:sz w:val="21"/>
+          <w:szCs w:val="21"/>
+          <w:lang w:eastAsia="en-IN"/>
+          <w14:ligatures w14:val="none"/>
+        </w:rPr>
+        <w:t xml:space="preserve"> → Application requesting access </w:t>
+      </w:r>
+      <w:proofErr w:type="gramStart"/>
+      <w:r>
+        <w:rPr>
+          <w:rFonts w:ascii="Segoe UI" w:eastAsia="Times New Roman" w:hAnsi="Segoe UI" w:cs="Segoe UI"/>
+          <w:kern w:val="0"/>
+          <w:sz w:val="21"/>
+          <w:szCs w:val="21"/>
+          <w:lang w:eastAsia="en-IN"/>
+          <w14:ligatures w14:val="none"/>
+        </w:rPr>
+        <w:t>( Spotify</w:t>
+      </w:r>
+      <w:proofErr w:type="gramEnd"/>
+      <w:r>
+        <w:rPr>
+          <w:rFonts w:ascii="Segoe UI" w:eastAsia="Times New Roman" w:hAnsi="Segoe UI" w:cs="Segoe UI"/>
+          <w:kern w:val="0"/>
+          <w:sz w:val="21"/>
+          <w:szCs w:val="21"/>
+          <w:lang w:eastAsia="en-IN"/>
+          <w14:ligatures w14:val="none"/>
+        </w:rPr>
+        <w:t xml:space="preserve"> )</w:t>
+      </w:r>
+    </w:p>
+    <w:p>
+      <w:pPr>
+        <w:spacing w:after="0" w:line="300" w:lineRule="atLeast"/>
+        <w:rPr>
+          <w:rFonts w:ascii="Segoe UI" w:eastAsia="Times New Roman" w:hAnsi="Segoe UI" w:cs="Segoe UI"/>
+          <w:kern w:val="0"/>
+          <w:sz w:val="21"/>
+          <w:szCs w:val="21"/>
+          <w:lang w:eastAsia="en-IN"/>
+          <w14:ligatures w14:val="none"/>
+        </w:rPr>
+      </w:pPr>
+      <w:proofErr w:type="gramStart"/>
+      <w:r>
+        <w:rPr>
+          <w:rFonts w:ascii="Segoe UI" w:eastAsia="Times New Roman" w:hAnsi="Symbol" w:cs="Segoe UI"/>
+          <w:kern w:val="0"/>
+          <w:sz w:val="21"/>
+          <w:szCs w:val="21"/>
+          <w:lang w:eastAsia="en-IN"/>
+          <w14:ligatures w14:val="none"/>
+        </w:rPr>
+        <w:t></w:t>
+      </w:r>
+      <w:r>
+        <w:rPr>
+          <w:rFonts w:ascii="Segoe UI" w:eastAsia="Times New Roman" w:hAnsi="Segoe UI" w:cs="Segoe UI"/>
+          <w:kern w:val="0"/>
+          <w:sz w:val="21"/>
+          <w:szCs w:val="21"/>
+          <w:lang w:eastAsia="en-IN"/>
+          <w14:ligatures w14:val="none"/>
+        </w:rPr>
+        <w:t xml:space="preserve">  </w:t>
+      </w:r>
+      <w:r>
+        <w:rPr>
+          <w:rFonts w:ascii="Segoe UI" w:eastAsia="Times New Roman" w:hAnsi="Segoe UI" w:cs="Segoe UI"/>
+          <w:b/>
+          <w:bCs/>
+          <w:kern w:val="0"/>
+          <w:sz w:val="21"/>
+          <w:szCs w:val="21"/>
+          <w:lang w:eastAsia="en-IN"/>
+          <w14:ligatures w14:val="none"/>
+        </w:rPr>
+        <w:t>Authorization</w:t>
+      </w:r>
+      <w:proofErr w:type="gramEnd"/>
+      <w:r>
+        <w:rPr>
+          <w:rFonts w:ascii="Segoe UI" w:eastAsia="Times New Roman" w:hAnsi="Segoe UI" w:cs="Segoe UI"/>
+          <w:b/>
+          <w:bCs/>
+          <w:kern w:val="0"/>
+          <w:sz w:val="21"/>
+          <w:szCs w:val="21"/>
+          <w:lang w:eastAsia="en-IN"/>
+          <w14:ligatures w14:val="none"/>
+        </w:rPr>
+        <w:t xml:space="preserve"> Server</w:t>
+      </w:r>
+      <w:r>
+        <w:rPr>
+          <w:rFonts w:ascii="Segoe UI" w:eastAsia="Times New Roman" w:hAnsi="Segoe UI" w:cs="Segoe UI"/>
+          <w:kern w:val="0"/>
+          <w:sz w:val="21"/>
+          <w:szCs w:val="21"/>
+          <w:lang w:eastAsia="en-IN"/>
+          <w14:ligatures w14:val="none"/>
+        </w:rPr>
+        <w:t xml:space="preserve"> → Google Auth Server </w:t>
+      </w:r>
+    </w:p>
+    <w:p>
+      <w:pPr>
+        <w:spacing w:after="0" w:line="300" w:lineRule="atLeast"/>
+        <w:rPr>
+          <w:rFonts w:ascii="Segoe UI" w:eastAsia="Times New Roman" w:hAnsi="Segoe UI" w:cs="Segoe UI"/>
+          <w:kern w:val="0"/>
+          <w:sz w:val="21"/>
+          <w:szCs w:val="21"/>
+          <w:lang w:eastAsia="en-IN"/>
+          <w14:ligatures w14:val="none"/>
+        </w:rPr>
+      </w:pPr>
+      <w:proofErr w:type="gramStart"/>
+      <w:r>
+        <w:rPr>
+          <w:rFonts w:ascii="Segoe UI" w:eastAsia="Times New Roman" w:hAnsi="Symbol" w:cs="Segoe UI"/>
+          <w:kern w:val="0"/>
+          <w:sz w:val="21"/>
+          <w:szCs w:val="21"/>
+          <w:lang w:eastAsia="en-IN"/>
+          <w14:ligatures w14:val="none"/>
+        </w:rPr>
+        <w:t></w:t>
+      </w:r>
+      <w:r>
+        <w:rPr>
+          <w:rFonts w:ascii="Segoe UI" w:eastAsia="Times New Roman" w:hAnsi="Segoe UI" w:cs="Segoe UI"/>
+          <w:kern w:val="0"/>
+          <w:sz w:val="21"/>
+          <w:szCs w:val="21"/>
+          <w:lang w:eastAsia="en-IN"/>
+          <w14:ligatures w14:val="none"/>
+        </w:rPr>
+        <w:t xml:space="preserve">  </w:t>
+      </w:r>
+      <w:r>
+        <w:rPr>
+          <w:rFonts w:ascii="Segoe UI" w:eastAsia="Times New Roman" w:hAnsi="Segoe UI" w:cs="Segoe UI"/>
+          <w:b/>
+          <w:bCs/>
+          <w:kern w:val="0"/>
+          <w:sz w:val="21"/>
+          <w:szCs w:val="21"/>
+          <w:lang w:eastAsia="en-IN"/>
+          <w14:ligatures w14:val="none"/>
+        </w:rPr>
+        <w:t>Access</w:t>
+      </w:r>
+      <w:proofErr w:type="gramEnd"/>
+      <w:r>
+        <w:rPr>
+          <w:rFonts w:ascii="Segoe UI" w:eastAsia="Times New Roman" w:hAnsi="Segoe UI" w:cs="Segoe UI"/>
+          <w:b/>
+          <w:bCs/>
+          <w:kern w:val="0"/>
+          <w:sz w:val="21"/>
+          <w:szCs w:val="21"/>
+          <w:lang w:eastAsia="en-IN"/>
+          <w14:ligatures w14:val="none"/>
+        </w:rPr>
+        <w:t xml:space="preserve"> Token</w:t>
+      </w:r>
+      <w:r>
+        <w:rPr>
+          <w:rFonts w:ascii="Segoe UI" w:eastAsia="Times New Roman" w:hAnsi="Segoe UI" w:cs="Segoe UI"/>
+          <w:kern w:val="0"/>
+          <w:sz w:val="21"/>
+          <w:szCs w:val="21"/>
+          <w:lang w:eastAsia="en-IN"/>
+          <w14:ligatures w14:val="none"/>
+        </w:rPr>
+        <w:t xml:space="preserve"> → Temporary credential used for API access </w:t>
+      </w:r>
+    </w:p>
+    <w:p>
+      <w:pPr>
+        <w:spacing w:after="0" w:line="300" w:lineRule="atLeast"/>
+        <w:rPr>
+          <w:rFonts w:ascii="Segoe UI" w:eastAsia="Times New Roman" w:hAnsi="Segoe UI" w:cs="Segoe UI"/>
+          <w:kern w:val="0"/>
+          <w:sz w:val="21"/>
+          <w:szCs w:val="21"/>
+          <w:lang w:eastAsia="en-IN"/>
+          <w14:ligatures w14:val="none"/>
+        </w:rPr>
+      </w:pPr>
+      <w:proofErr w:type="gramStart"/>
+      <w:r>
+        <w:rPr>
+          <w:rFonts w:ascii="Segoe UI" w:eastAsia="Times New Roman" w:hAnsi="Symbol" w:cs="Segoe UI"/>
+          <w:kern w:val="0"/>
+          <w:sz w:val="21"/>
+          <w:szCs w:val="21"/>
+          <w:lang w:eastAsia="en-IN"/>
+          <w14:ligatures w14:val="none"/>
+        </w:rPr>
+        <w:t></w:t>
+      </w:r>
+      <w:r>
+        <w:rPr>
+          <w:rFonts w:ascii="Segoe UI" w:eastAsia="Times New Roman" w:hAnsi="Segoe UI" w:cs="Segoe UI"/>
+          <w:kern w:val="0"/>
+          <w:sz w:val="21"/>
+          <w:szCs w:val="21"/>
+          <w:lang w:eastAsia="en-IN"/>
+          <w14:ligatures w14:val="none"/>
+        </w:rPr>
+        <w:t xml:space="preserve">  </w:t>
+      </w:r>
+      <w:r>
+        <w:rPr>
+          <w:rFonts w:ascii="Segoe UI" w:eastAsia="Times New Roman" w:hAnsi="Segoe UI" w:cs="Segoe UI"/>
+          <w:b/>
+          <w:bCs/>
+          <w:kern w:val="0"/>
+          <w:sz w:val="21"/>
+          <w:szCs w:val="21"/>
+          <w:lang w:eastAsia="en-IN"/>
+          <w14:ligatures w14:val="none"/>
+        </w:rPr>
+        <w:t>Resource</w:t>
+      </w:r>
+      <w:proofErr w:type="gramEnd"/>
+      <w:r>
+        <w:rPr>
+          <w:rFonts w:ascii="Segoe UI" w:eastAsia="Times New Roman" w:hAnsi="Segoe UI" w:cs="Segoe UI"/>
+          <w:b/>
+          <w:bCs/>
+          <w:kern w:val="0"/>
+          <w:sz w:val="21"/>
+          <w:szCs w:val="21"/>
+          <w:lang w:eastAsia="en-IN"/>
+          <w14:ligatures w14:val="none"/>
+        </w:rPr>
+        <w:t xml:space="preserve"> Server</w:t>
+      </w:r>
+      <w:r>
+        <w:rPr>
+          <w:rFonts w:ascii="Segoe UI" w:eastAsia="Times New Roman" w:hAnsi="Segoe UI" w:cs="Segoe UI"/>
+          <w:kern w:val="0"/>
+          <w:sz w:val="21"/>
+          <w:szCs w:val="21"/>
+          <w:lang w:eastAsia="en-IN"/>
+          <w14:ligatures w14:val="none"/>
+        </w:rPr>
+        <w:t xml:space="preserve"> → API containing user data</w:t>
+      </w:r>
+      <w:r>
+        <w:rPr>
+          <w:rFonts w:ascii="Segoe UI" w:eastAsia="Times New Roman" w:hAnsi="Segoe UI" w:cs="Segoe UI"/>
+          <w:kern w:val="0"/>
+          <w:sz w:val="21"/>
+          <w:szCs w:val="21"/>
+          <w:lang w:eastAsia="en-IN"/>
+          <w14:ligatures w14:val="none"/>
+        </w:rPr>
+        <w:t xml:space="preserve"> (</w:t>
+      </w:r>
+      <w:r>
+        <w:rPr>
+          <w:rFonts w:ascii="Segoe UI" w:eastAsia="Times New Roman" w:hAnsi="Segoe UI" w:cs="Segoe UI"/>
+          <w:kern w:val="0"/>
+          <w:sz w:val="21"/>
+          <w:szCs w:val="21"/>
+          <w:lang w:eastAsia="en-IN"/>
+          <w14:ligatures w14:val="none"/>
+        </w:rPr>
+        <w:t>Google APIs (Profile, Email, etc.)</w:t>
+      </w:r>
+    </w:p>
+    <w:p>
+      <w:pPr>
+        <w:spacing w:after="0" w:line="300" w:lineRule="atLeast"/>
+        <w:rPr>
+          <w:lang w:eastAsia="en-IN"/>
+        </w:rPr>
+      </w:pPr>
+    </w:p>
+    <w:p>
+      <w:pPr>
+        <w:spacing w:after="0" w:line="240" w:lineRule="auto"/>
+        <w:rPr>
+          <w:rFonts w:eastAsia="Times New Roman" w:cs="Times New Roman"/>
+          <w:kern w:val="0"/>
+          <w:sz w:val="24"/>
+          <w:lang w:val="en-US"/>
+          <w14:ligatures w14:val="none"/>
+        </w:rPr>
+      </w:pPr>
+      <w:r>
+        <w:rPr>
+          <w:rFonts w:eastAsia="Times New Roman" w:cs="Times New Roman"/>
+          <w:kern w:val="0"/>
+          <w:sz w:val="24"/>
+          <w:lang w:val="en-US"/>
+          <w14:ligatures w14:val="none"/>
+        </w:rPr>
+        <w:t> OAuth2 is an authorization framework often using tokens like JWT to grant access to resources.</w:t>
       </w:r>
     </w:p>
     <w:p>
@@ -12079,6 +13112,7 @@
                 <w:lang w:val="en-US"/>
                 <w14:ligatures w14:val="none"/>
               </w:rPr>
+              <w:lastRenderedPageBreak/>
               <w:t>Authentication</w:t>
             </w:r>
           </w:p>
@@ -12295,7 +13329,6 @@
     </w:p>
     <w:p>
       <w:r>
-        <w:lastRenderedPageBreak/>
         <w:t xml:space="preserve">Methods in a @Controller-annotated class typically return view names, which are resolved by view resolvers (like JSP, </w:t>
       </w:r>
       <w:proofErr w:type="spellStart"/>
@@ -12759,6 +13792,7 @@
         <w:pStyle w:val="Heading2"/>
       </w:pPr>
       <w:r>
+        <w:lastRenderedPageBreak/>
         <w:t>@RestController</w:t>
       </w:r>
     </w:p>
@@ -12803,24 +13837,2309 @@
         <w:pStyle w:val="Heading1"/>
       </w:pPr>
       <w:r>
-        <w:t xml:space="preserve">Inversion Of </w:t>
-      </w:r>
-      <w:r>
-        <w:t>Control (</w:t>
-      </w:r>
-      <w:r>
-        <w:t>IOC)</w:t>
-      </w:r>
-    </w:p>
-    <w:p>
-      <w:r>
-        <w:t xml:space="preserve">IoC means </w:t>
-      </w:r>
+        <w:t>CRUD operations with controller</w:t>
+      </w:r>
+    </w:p>
+    <w:p>
+      <w:pPr>
+        <w:rPr>
+          <w:lang w:val="en-US"/>
+        </w:rPr>
+      </w:pPr>
+    </w:p>
+    <w:p>
+      <w:pPr>
+        <w:rPr>
+          <w:lang w:val="en-US"/>
+        </w:rPr>
+      </w:pPr>
+      <w:proofErr w:type="gramStart"/>
+      <w:r>
+        <w:rPr>
+          <w:lang w:val="en-US"/>
+        </w:rPr>
+        <w:t>@RestController</w:t>
+      </w:r>
+      <w:proofErr w:type="gramEnd"/>
+    </w:p>
+    <w:p>
+      <w:pPr>
+        <w:rPr>
+          <w:lang w:val="en-US"/>
+        </w:rPr>
+      </w:pPr>
+      <w:proofErr w:type="gramStart"/>
+      <w:r>
+        <w:rPr>
+          <w:lang w:val="en-US"/>
+        </w:rPr>
+        <w:t>@RequestMapping</w:t>
+      </w:r>
+      <w:proofErr w:type="gramEnd"/>
+      <w:r>
+        <w:rPr>
+          <w:lang w:val="en-US"/>
+        </w:rPr>
+        <w:t>("/employees")</w:t>
+      </w:r>
+    </w:p>
+    <w:p>
+      <w:pPr>
+        <w:rPr>
+          <w:lang w:val="en-US"/>
+        </w:rPr>
+      </w:pPr>
+      <w:r>
+        <w:rPr>
+          <w:lang w:val="en-US"/>
+        </w:rPr>
+        <w:t xml:space="preserve">public class </w:t>
+      </w:r>
+      <w:proofErr w:type="spellStart"/>
+      <w:r>
+        <w:rPr>
+          <w:lang w:val="en-US"/>
+        </w:rPr>
+        <w:t>EmployeeController</w:t>
+      </w:r>
+      <w:proofErr w:type="spellEnd"/>
+      <w:r>
+        <w:rPr>
+          <w:lang w:val="en-US"/>
+        </w:rPr>
+        <w:t xml:space="preserve"> {</w:t>
+      </w:r>
+    </w:p>
+    <w:p>
+      <w:pPr>
+        <w:rPr>
+          <w:lang w:val="en-US"/>
+        </w:rPr>
+      </w:pPr>
+    </w:p>
+    <w:p>
+      <w:pPr>
+        <w:rPr>
+          <w:lang w:val="en-US"/>
+        </w:rPr>
+      </w:pPr>
+      <w:r>
+        <w:rPr>
+          <w:lang w:val="en-US"/>
+        </w:rPr>
+        <w:t xml:space="preserve">    </w:t>
+      </w:r>
+      <w:proofErr w:type="gramStart"/>
+      <w:r>
+        <w:rPr>
+          <w:lang w:val="en-US"/>
+        </w:rPr>
+        <w:t>@PostMapping</w:t>
+      </w:r>
+      <w:proofErr w:type="gramEnd"/>
+    </w:p>
+    <w:p>
+      <w:pPr>
+        <w:rPr>
+          <w:lang w:val="en-US"/>
+        </w:rPr>
+      </w:pPr>
+      <w:r>
+        <w:rPr>
+          <w:lang w:val="en-US"/>
+        </w:rPr>
+        <w:t xml:space="preserve">    public </w:t>
+      </w:r>
+      <w:proofErr w:type="spellStart"/>
+      <w:r>
+        <w:rPr>
+          <w:lang w:val="en-US"/>
+        </w:rPr>
+        <w:t>ResponseEntity</w:t>
+      </w:r>
+      <w:proofErr w:type="spellEnd"/>
+      <w:r>
+        <w:rPr>
+          <w:lang w:val="en-US"/>
+        </w:rPr>
+        <w:t xml:space="preserve">&lt;Employee&gt; </w:t>
+      </w:r>
+      <w:proofErr w:type="spellStart"/>
+      <w:proofErr w:type="gramStart"/>
+      <w:r>
+        <w:rPr>
+          <w:lang w:val="en-US"/>
+        </w:rPr>
+        <w:t>createEmployee</w:t>
+      </w:r>
+      <w:proofErr w:type="spellEnd"/>
+      <w:r>
+        <w:rPr>
+          <w:lang w:val="en-US"/>
+        </w:rPr>
+        <w:t>(</w:t>
+      </w:r>
+      <w:proofErr w:type="gramEnd"/>
+      <w:r>
+        <w:rPr>
+          <w:lang w:val="en-US"/>
+        </w:rPr>
+        <w:t>@RequestBody Employee employee) {</w:t>
+      </w:r>
+    </w:p>
+    <w:p>
+      <w:pPr>
+        <w:rPr>
+          <w:lang w:val="en-US"/>
+        </w:rPr>
+      </w:pPr>
+      <w:r>
+        <w:rPr>
+          <w:lang w:val="en-US"/>
+        </w:rPr>
+        <w:t xml:space="preserve">        Employee </w:t>
+      </w:r>
+      <w:proofErr w:type="spellStart"/>
+      <w:r>
+        <w:rPr>
+          <w:lang w:val="en-US"/>
+        </w:rPr>
+        <w:t>savedEmployee</w:t>
+      </w:r>
+      <w:proofErr w:type="spellEnd"/>
+      <w:r>
+        <w:rPr>
+          <w:lang w:val="en-US"/>
+        </w:rPr>
+        <w:t xml:space="preserve"> = </w:t>
+      </w:r>
+      <w:proofErr w:type="spellStart"/>
+      <w:r>
+        <w:rPr>
+          <w:lang w:val="en-US"/>
+        </w:rPr>
+        <w:t>employeeService.save</w:t>
+      </w:r>
+      <w:proofErr w:type="spellEnd"/>
+      <w:r>
+        <w:rPr>
+          <w:lang w:val="en-US"/>
+        </w:rPr>
+        <w:t>(employee);</w:t>
+      </w:r>
+    </w:p>
+    <w:p>
+      <w:pPr>
+        <w:rPr>
+          <w:lang w:val="en-US"/>
+        </w:rPr>
+      </w:pPr>
+      <w:r>
+        <w:rPr>
+          <w:lang w:val="en-US"/>
+        </w:rPr>
+        <w:t xml:space="preserve">        return </w:t>
+      </w:r>
+      <w:proofErr w:type="spellStart"/>
+      <w:r>
+        <w:rPr>
+          <w:lang w:val="en-US"/>
+        </w:rPr>
+        <w:t>ResponseEntity.status</w:t>
+      </w:r>
+      <w:proofErr w:type="spellEnd"/>
+      <w:r>
+        <w:rPr>
+          <w:lang w:val="en-US"/>
+        </w:rPr>
+        <w:t>(</w:t>
+      </w:r>
+      <w:proofErr w:type="spellStart"/>
+      <w:r>
+        <w:rPr>
+          <w:lang w:val="en-US"/>
+        </w:rPr>
+        <w:t>HttpStatus.CREATED</w:t>
+      </w:r>
+      <w:proofErr w:type="spellEnd"/>
+      <w:r>
+        <w:rPr>
+          <w:lang w:val="en-US"/>
+        </w:rPr>
+        <w:t>)</w:t>
+      </w:r>
+    </w:p>
+    <w:p>
+      <w:pPr>
+        <w:rPr>
+          <w:lang w:val="en-US"/>
+        </w:rPr>
+      </w:pPr>
+      <w:r>
+        <w:rPr>
+          <w:lang w:val="en-US"/>
+        </w:rPr>
+        <w:t xml:space="preserve">                </w:t>
+      </w:r>
+      <w:proofErr w:type="gramStart"/>
+      <w:r>
+        <w:rPr>
+          <w:lang w:val="en-US"/>
+        </w:rPr>
+        <w:t>.body</w:t>
+      </w:r>
+      <w:proofErr w:type="gramEnd"/>
+      <w:r>
+        <w:rPr>
+          <w:lang w:val="en-US"/>
+        </w:rPr>
+        <w:t>(</w:t>
+      </w:r>
+      <w:proofErr w:type="spellStart"/>
+      <w:r>
+        <w:rPr>
+          <w:lang w:val="en-US"/>
+        </w:rPr>
+        <w:t>savedEmployee</w:t>
+      </w:r>
+      <w:proofErr w:type="spellEnd"/>
+      <w:r>
+        <w:rPr>
+          <w:lang w:val="en-US"/>
+        </w:rPr>
+        <w:t>); // 201</w:t>
+      </w:r>
+    </w:p>
+    <w:p>
+      <w:pPr>
+        <w:rPr>
+          <w:lang w:val="en-US"/>
+        </w:rPr>
+      </w:pPr>
+      <w:r>
+        <w:rPr>
+          <w:lang w:val="en-US"/>
+        </w:rPr>
+        <w:t xml:space="preserve">    }</w:t>
+      </w:r>
+    </w:p>
+    <w:p>
+      <w:pPr>
+        <w:rPr>
+          <w:lang w:val="en-US"/>
+        </w:rPr>
+      </w:pPr>
+    </w:p>
+    <w:p>
+      <w:pPr>
+        <w:rPr>
+          <w:lang w:val="en-US"/>
+        </w:rPr>
+      </w:pPr>
+      <w:r>
+        <w:rPr>
+          <w:lang w:val="en-US"/>
+        </w:rPr>
+        <w:t xml:space="preserve">    </w:t>
+      </w:r>
+      <w:proofErr w:type="gramStart"/>
+      <w:r>
+        <w:rPr>
+          <w:lang w:val="en-US"/>
+        </w:rPr>
+        <w:t>@GetMapping</w:t>
+      </w:r>
+      <w:proofErr w:type="gramEnd"/>
+      <w:r>
+        <w:rPr>
+          <w:lang w:val="en-US"/>
+        </w:rPr>
+        <w:t>(</w:t>
+      </w:r>
+      <w:proofErr w:type="gramStart"/>
+      <w:r>
+        <w:rPr>
+          <w:lang w:val="en-US"/>
+        </w:rPr>
+        <w:t>"/{id}"</w:t>
+      </w:r>
+      <w:proofErr w:type="gramEnd"/>
+      <w:r>
+        <w:rPr>
+          <w:lang w:val="en-US"/>
+        </w:rPr>
+        <w:t>)</w:t>
+      </w:r>
+    </w:p>
+    <w:p>
+      <w:pPr>
+        <w:rPr>
+          <w:lang w:val="en-US"/>
+        </w:rPr>
+      </w:pPr>
+      <w:r>
+        <w:rPr>
+          <w:lang w:val="en-US"/>
+        </w:rPr>
+        <w:t xml:space="preserve">    public </w:t>
+      </w:r>
+      <w:proofErr w:type="spellStart"/>
+      <w:r>
+        <w:rPr>
+          <w:lang w:val="en-US"/>
+        </w:rPr>
+        <w:t>ResponseEntity</w:t>
+      </w:r>
+      <w:proofErr w:type="spellEnd"/>
+      <w:r>
+        <w:rPr>
+          <w:lang w:val="en-US"/>
+        </w:rPr>
+        <w:t xml:space="preserve">&lt;Employee&gt; </w:t>
+      </w:r>
+      <w:proofErr w:type="spellStart"/>
+      <w:proofErr w:type="gramStart"/>
+      <w:r>
+        <w:rPr>
+          <w:lang w:val="en-US"/>
+        </w:rPr>
+        <w:t>getEmployee</w:t>
+      </w:r>
+      <w:proofErr w:type="spellEnd"/>
+      <w:r>
+        <w:rPr>
+          <w:lang w:val="en-US"/>
+        </w:rPr>
+        <w:t>(</w:t>
+      </w:r>
+      <w:proofErr w:type="gramEnd"/>
+      <w:r>
+        <w:rPr>
+          <w:lang w:val="en-US"/>
+        </w:rPr>
+        <w:t>@PathVariable Long id) {</w:t>
+      </w:r>
+    </w:p>
+    <w:p>
+      <w:pPr>
+        <w:rPr>
+          <w:lang w:val="en-US"/>
+        </w:rPr>
+      </w:pPr>
+    </w:p>
+    <w:p>
+      <w:pPr>
+        <w:rPr>
+          <w:lang w:val="en-US"/>
+        </w:rPr>
+      </w:pPr>
+      <w:r>
+        <w:rPr>
+          <w:lang w:val="en-US"/>
+        </w:rPr>
+        <w:t xml:space="preserve">        Optional&lt;Employee&gt; employee = </w:t>
+      </w:r>
+      <w:proofErr w:type="spellStart"/>
+      <w:r>
+        <w:rPr>
+          <w:lang w:val="en-US"/>
+        </w:rPr>
+        <w:t>employeeService.findById</w:t>
+      </w:r>
+      <w:proofErr w:type="spellEnd"/>
+      <w:r>
+        <w:rPr>
+          <w:lang w:val="en-US"/>
+        </w:rPr>
+        <w:t>(id);</w:t>
+      </w:r>
+    </w:p>
+    <w:p>
+      <w:pPr>
+        <w:rPr>
+          <w:lang w:val="en-US"/>
+        </w:rPr>
+      </w:pPr>
+    </w:p>
+    <w:p>
+      <w:pPr>
+        <w:rPr>
+          <w:lang w:val="en-US"/>
+        </w:rPr>
+      </w:pPr>
+      <w:r>
+        <w:rPr>
+          <w:lang w:val="en-US"/>
+        </w:rPr>
+        <w:t xml:space="preserve">        if (</w:t>
+      </w:r>
+      <w:proofErr w:type="spellStart"/>
+      <w:proofErr w:type="gramStart"/>
+      <w:r>
+        <w:rPr>
+          <w:lang w:val="en-US"/>
+        </w:rPr>
+        <w:t>employee.isPresent</w:t>
+      </w:r>
+      <w:proofErr w:type="spellEnd"/>
+      <w:proofErr w:type="gramEnd"/>
+      <w:r>
+        <w:rPr>
+          <w:lang w:val="en-US"/>
+        </w:rPr>
+        <w:t>()) {</w:t>
+      </w:r>
+    </w:p>
+    <w:p>
+      <w:pPr>
+        <w:rPr>
+          <w:lang w:val="en-US"/>
+        </w:rPr>
+      </w:pPr>
+      <w:r>
+        <w:rPr>
+          <w:lang w:val="en-US"/>
+        </w:rPr>
+        <w:lastRenderedPageBreak/>
+        <w:t xml:space="preserve">            return </w:t>
+      </w:r>
+      <w:proofErr w:type="spellStart"/>
+      <w:r>
+        <w:rPr>
+          <w:lang w:val="en-US"/>
+        </w:rPr>
+        <w:t>ResponseEntity.ok</w:t>
+      </w:r>
+      <w:proofErr w:type="spellEnd"/>
+      <w:r>
+        <w:rPr>
+          <w:lang w:val="en-US"/>
+        </w:rPr>
+        <w:t>(</w:t>
+      </w:r>
+      <w:proofErr w:type="spellStart"/>
+      <w:proofErr w:type="gramStart"/>
+      <w:r>
+        <w:rPr>
+          <w:lang w:val="en-US"/>
+        </w:rPr>
+        <w:t>employee.get</w:t>
+      </w:r>
+      <w:proofErr w:type="spellEnd"/>
+      <w:r>
+        <w:rPr>
+          <w:lang w:val="en-US"/>
+        </w:rPr>
+        <w:t>(</w:t>
+      </w:r>
+      <w:proofErr w:type="gramEnd"/>
+      <w:r>
+        <w:rPr>
+          <w:lang w:val="en-US"/>
+        </w:rPr>
+        <w:t>)); // 200</w:t>
+      </w:r>
+    </w:p>
+    <w:p>
+      <w:pPr>
+        <w:rPr>
+          <w:lang w:val="en-US"/>
+        </w:rPr>
+      </w:pPr>
+      <w:r>
+        <w:rPr>
+          <w:lang w:val="en-US"/>
+        </w:rPr>
+        <w:t xml:space="preserve">        }</w:t>
+      </w:r>
+    </w:p>
+    <w:p>
+      <w:pPr>
+        <w:rPr>
+          <w:lang w:val="en-US"/>
+        </w:rPr>
+      </w:pPr>
+    </w:p>
+    <w:p>
+      <w:pPr>
+        <w:rPr>
+          <w:lang w:val="en-US"/>
+        </w:rPr>
+      </w:pPr>
+      <w:r>
+        <w:rPr>
+          <w:lang w:val="en-US"/>
+        </w:rPr>
+        <w:t xml:space="preserve">        return </w:t>
+      </w:r>
+      <w:proofErr w:type="spellStart"/>
+      <w:r>
+        <w:rPr>
+          <w:lang w:val="en-US"/>
+        </w:rPr>
+        <w:t>ResponseEntity.notFound</w:t>
+      </w:r>
+      <w:proofErr w:type="spellEnd"/>
+      <w:r>
+        <w:rPr>
+          <w:lang w:val="en-US"/>
+        </w:rPr>
+        <w:t>(</w:t>
+      </w:r>
+      <w:proofErr w:type="gramStart"/>
+      <w:r>
+        <w:rPr>
+          <w:lang w:val="en-US"/>
+        </w:rPr>
+        <w:t>).build</w:t>
+      </w:r>
+      <w:proofErr w:type="gramEnd"/>
+      <w:r>
+        <w:rPr>
+          <w:lang w:val="en-US"/>
+        </w:rPr>
+        <w:t>(); // 404</w:t>
+      </w:r>
+    </w:p>
+    <w:p>
+      <w:pPr>
+        <w:rPr>
+          <w:lang w:val="en-US"/>
+        </w:rPr>
+      </w:pPr>
+      <w:r>
+        <w:rPr>
+          <w:lang w:val="en-US"/>
+        </w:rPr>
+        <w:t xml:space="preserve">    }</w:t>
+      </w:r>
+    </w:p>
+    <w:p>
+      <w:pPr>
+        <w:rPr>
+          <w:lang w:val="en-US"/>
+        </w:rPr>
+      </w:pPr>
+    </w:p>
+    <w:p>
+      <w:pPr>
+        <w:rPr>
+          <w:lang w:val="en-US"/>
+        </w:rPr>
+      </w:pPr>
+      <w:r>
+        <w:rPr>
+          <w:lang w:val="en-US"/>
+        </w:rPr>
+        <w:t xml:space="preserve">    </w:t>
+      </w:r>
+      <w:proofErr w:type="gramStart"/>
+      <w:r>
+        <w:rPr>
+          <w:lang w:val="en-US"/>
+        </w:rPr>
+        <w:t>@PutMapping</w:t>
+      </w:r>
+      <w:proofErr w:type="gramEnd"/>
+      <w:r>
+        <w:rPr>
+          <w:lang w:val="en-US"/>
+        </w:rPr>
+        <w:t>(</w:t>
+      </w:r>
+      <w:proofErr w:type="gramStart"/>
+      <w:r>
+        <w:rPr>
+          <w:lang w:val="en-US"/>
+        </w:rPr>
+        <w:t>"/{id}"</w:t>
+      </w:r>
+      <w:proofErr w:type="gramEnd"/>
+      <w:r>
+        <w:rPr>
+          <w:lang w:val="en-US"/>
+        </w:rPr>
+        <w:t>)</w:t>
+      </w:r>
+    </w:p>
+    <w:p>
+      <w:pPr>
+        <w:rPr>
+          <w:lang w:val="en-US"/>
+        </w:rPr>
+      </w:pPr>
+      <w:r>
+        <w:rPr>
+          <w:lang w:val="en-US"/>
+        </w:rPr>
+        <w:t xml:space="preserve">    public </w:t>
+      </w:r>
+      <w:proofErr w:type="spellStart"/>
+      <w:r>
+        <w:rPr>
+          <w:lang w:val="en-US"/>
+        </w:rPr>
+        <w:t>ResponseEntity</w:t>
+      </w:r>
+      <w:proofErr w:type="spellEnd"/>
+      <w:r>
+        <w:rPr>
+          <w:lang w:val="en-US"/>
+        </w:rPr>
+        <w:t xml:space="preserve">&lt;Employee&gt; </w:t>
+      </w:r>
+      <w:proofErr w:type="spellStart"/>
+      <w:proofErr w:type="gramStart"/>
+      <w:r>
+        <w:rPr>
+          <w:lang w:val="en-US"/>
+        </w:rPr>
+        <w:t>updateEmployee</w:t>
+      </w:r>
+      <w:proofErr w:type="spellEnd"/>
+      <w:r>
+        <w:rPr>
+          <w:lang w:val="en-US"/>
+        </w:rPr>
+        <w:t>(</w:t>
+      </w:r>
+      <w:proofErr w:type="gramEnd"/>
+    </w:p>
+    <w:p>
+      <w:pPr>
+        <w:rPr>
+          <w:lang w:val="en-US"/>
+        </w:rPr>
+      </w:pPr>
+      <w:r>
+        <w:rPr>
+          <w:lang w:val="en-US"/>
+        </w:rPr>
+        <w:t xml:space="preserve">            </w:t>
+      </w:r>
+      <w:proofErr w:type="gramStart"/>
+      <w:r>
+        <w:rPr>
+          <w:lang w:val="en-US"/>
+        </w:rPr>
+        <w:t>@PathVariable</w:t>
+      </w:r>
+      <w:proofErr w:type="gramEnd"/>
+      <w:r>
+        <w:rPr>
+          <w:lang w:val="en-US"/>
+        </w:rPr>
+        <w:t xml:space="preserve"> Long id,</w:t>
+      </w:r>
+    </w:p>
+    <w:p>
+      <w:pPr>
+        <w:rPr>
+          <w:lang w:val="en-US"/>
+        </w:rPr>
+      </w:pPr>
+      <w:r>
+        <w:rPr>
+          <w:lang w:val="en-US"/>
+        </w:rPr>
+        <w:t xml:space="preserve">            @RequestBody Employee </w:t>
+      </w:r>
+      <w:proofErr w:type="gramStart"/>
+      <w:r>
+        <w:rPr>
+          <w:lang w:val="en-US"/>
+        </w:rPr>
+        <w:t>employee) {</w:t>
+      </w:r>
+      <w:proofErr w:type="gramEnd"/>
+    </w:p>
+    <w:p>
+      <w:pPr>
+        <w:rPr>
+          <w:lang w:val="en-US"/>
+        </w:rPr>
+      </w:pPr>
+    </w:p>
+    <w:p>
+      <w:pPr>
+        <w:rPr>
+          <w:lang w:val="en-US"/>
+        </w:rPr>
+      </w:pPr>
+      <w:r>
+        <w:rPr>
+          <w:lang w:val="en-US"/>
+        </w:rPr>
+        <w:t xml:space="preserve">        if </w:t>
+      </w:r>
+      <w:proofErr w:type="gramStart"/>
+      <w:r>
+        <w:rPr>
+          <w:lang w:val="en-US"/>
+        </w:rPr>
+        <w:t>(!</w:t>
+      </w:r>
+      <w:proofErr w:type="spellStart"/>
+      <w:r>
+        <w:rPr>
+          <w:lang w:val="en-US"/>
+        </w:rPr>
+        <w:t>employeeService.existsById</w:t>
+      </w:r>
+      <w:proofErr w:type="spellEnd"/>
+      <w:proofErr w:type="gramEnd"/>
+      <w:r>
+        <w:rPr>
+          <w:lang w:val="en-US"/>
+        </w:rPr>
+        <w:t>(id</w:t>
+      </w:r>
+      <w:proofErr w:type="gramStart"/>
+      <w:r>
+        <w:rPr>
+          <w:lang w:val="en-US"/>
+        </w:rPr>
+        <w:t>)) {</w:t>
+      </w:r>
+      <w:proofErr w:type="gramEnd"/>
+    </w:p>
+    <w:p>
+      <w:pPr>
+        <w:rPr>
+          <w:lang w:val="en-US"/>
+        </w:rPr>
+      </w:pPr>
+      <w:r>
+        <w:rPr>
+          <w:lang w:val="en-US"/>
+        </w:rPr>
+        <w:t xml:space="preserve">            return </w:t>
+      </w:r>
+      <w:proofErr w:type="spellStart"/>
+      <w:r>
+        <w:rPr>
+          <w:lang w:val="en-US"/>
+        </w:rPr>
+        <w:t>ResponseEntity.notFound</w:t>
+      </w:r>
+      <w:proofErr w:type="spellEnd"/>
+      <w:r>
+        <w:rPr>
+          <w:lang w:val="en-US"/>
+        </w:rPr>
+        <w:t>(</w:t>
+      </w:r>
+      <w:proofErr w:type="gramStart"/>
+      <w:r>
+        <w:rPr>
+          <w:lang w:val="en-US"/>
+        </w:rPr>
+        <w:t>).build</w:t>
+      </w:r>
+      <w:proofErr w:type="gramEnd"/>
+      <w:r>
+        <w:rPr>
+          <w:lang w:val="en-US"/>
+        </w:rPr>
+        <w:t>(); // 404</w:t>
+      </w:r>
+    </w:p>
+    <w:p>
+      <w:pPr>
+        <w:rPr>
+          <w:lang w:val="en-US"/>
+        </w:rPr>
+      </w:pPr>
+      <w:r>
+        <w:rPr>
+          <w:lang w:val="en-US"/>
+        </w:rPr>
+        <w:t xml:space="preserve">        }</w:t>
+      </w:r>
+    </w:p>
+    <w:p>
+      <w:pPr>
+        <w:rPr>
+          <w:lang w:val="en-US"/>
+        </w:rPr>
+      </w:pPr>
+    </w:p>
+    <w:p>
+      <w:pPr>
+        <w:rPr>
+          <w:lang w:val="en-US"/>
+        </w:rPr>
+      </w:pPr>
+      <w:r>
+        <w:rPr>
+          <w:lang w:val="en-US"/>
+        </w:rPr>
+        <w:t xml:space="preserve">        Employee </w:t>
+      </w:r>
+      <w:proofErr w:type="spellStart"/>
+      <w:r>
+        <w:rPr>
+          <w:lang w:val="en-US"/>
+        </w:rPr>
+        <w:t>updatedEmployee</w:t>
+      </w:r>
+      <w:proofErr w:type="spellEnd"/>
+      <w:r>
+        <w:rPr>
+          <w:lang w:val="en-US"/>
+        </w:rPr>
+        <w:t xml:space="preserve"> = </w:t>
+      </w:r>
+      <w:proofErr w:type="spellStart"/>
+      <w:r>
+        <w:rPr>
+          <w:lang w:val="en-US"/>
+        </w:rPr>
+        <w:t>employeeService.update</w:t>
+      </w:r>
+      <w:proofErr w:type="spellEnd"/>
+      <w:r>
+        <w:rPr>
+          <w:lang w:val="en-US"/>
+        </w:rPr>
+        <w:t>(id, employee);</w:t>
+      </w:r>
+    </w:p>
+    <w:p>
+      <w:pPr>
+        <w:rPr>
+          <w:lang w:val="en-US"/>
+        </w:rPr>
+      </w:pPr>
+      <w:r>
+        <w:rPr>
+          <w:lang w:val="en-US"/>
+        </w:rPr>
+        <w:t xml:space="preserve">        </w:t>
+      </w:r>
+      <w:proofErr w:type="gramStart"/>
+      <w:r>
+        <w:rPr>
+          <w:lang w:val="en-US"/>
+        </w:rPr>
+        <w:t xml:space="preserve">return </w:t>
+      </w:r>
+      <w:proofErr w:type="spellStart"/>
+      <w:r>
+        <w:rPr>
+          <w:lang w:val="en-US"/>
+        </w:rPr>
+        <w:t>ResponseEntity</w:t>
+      </w:r>
+      <w:proofErr w:type="gramEnd"/>
+      <w:r>
+        <w:rPr>
+          <w:lang w:val="en-US"/>
+        </w:rPr>
+        <w:t>.ok</w:t>
+      </w:r>
+      <w:proofErr w:type="spellEnd"/>
+      <w:r>
+        <w:rPr>
+          <w:lang w:val="en-US"/>
+        </w:rPr>
+        <w:t>(</w:t>
+      </w:r>
+      <w:proofErr w:type="spellStart"/>
+      <w:r>
+        <w:rPr>
+          <w:lang w:val="en-US"/>
+        </w:rPr>
+        <w:t>updatedEmployee</w:t>
+      </w:r>
+      <w:proofErr w:type="spellEnd"/>
+      <w:r>
+        <w:rPr>
+          <w:lang w:val="en-US"/>
+        </w:rPr>
+        <w:t>); // 200</w:t>
+      </w:r>
+    </w:p>
+    <w:p>
+      <w:pPr>
+        <w:rPr>
+          <w:lang w:val="en-US"/>
+        </w:rPr>
+      </w:pPr>
+      <w:r>
+        <w:rPr>
+          <w:lang w:val="en-US"/>
+        </w:rPr>
+        <w:t xml:space="preserve">    }</w:t>
+      </w:r>
+    </w:p>
+    <w:p>
+      <w:pPr>
+        <w:rPr>
+          <w:lang w:val="en-US"/>
+        </w:rPr>
+      </w:pPr>
+    </w:p>
+    <w:p>
+      <w:pPr>
+        <w:rPr>
+          <w:lang w:val="en-US"/>
+        </w:rPr>
+      </w:pPr>
+      <w:r>
+        <w:rPr>
+          <w:lang w:val="en-US"/>
+        </w:rPr>
+        <w:t xml:space="preserve">    </w:t>
+      </w:r>
+      <w:proofErr w:type="gramStart"/>
+      <w:r>
+        <w:rPr>
+          <w:lang w:val="en-US"/>
+        </w:rPr>
+        <w:t>@DeleteMapping</w:t>
+      </w:r>
+      <w:proofErr w:type="gramEnd"/>
+      <w:r>
+        <w:rPr>
+          <w:lang w:val="en-US"/>
+        </w:rPr>
+        <w:t>(</w:t>
+      </w:r>
+      <w:proofErr w:type="gramStart"/>
+      <w:r>
+        <w:rPr>
+          <w:lang w:val="en-US"/>
+        </w:rPr>
+        <w:t>"/{id}"</w:t>
+      </w:r>
+      <w:proofErr w:type="gramEnd"/>
+      <w:r>
+        <w:rPr>
+          <w:lang w:val="en-US"/>
+        </w:rPr>
+        <w:t>)</w:t>
+      </w:r>
+    </w:p>
+    <w:p>
+      <w:pPr>
+        <w:rPr>
+          <w:lang w:val="en-US"/>
+        </w:rPr>
+      </w:pPr>
+      <w:r>
+        <w:rPr>
+          <w:lang w:val="en-US"/>
+        </w:rPr>
+        <w:t xml:space="preserve">    public </w:t>
+      </w:r>
+      <w:proofErr w:type="spellStart"/>
+      <w:r>
+        <w:rPr>
+          <w:lang w:val="en-US"/>
+        </w:rPr>
+        <w:t>ResponseEntity</w:t>
+      </w:r>
+      <w:proofErr w:type="spellEnd"/>
+      <w:r>
+        <w:rPr>
+          <w:lang w:val="en-US"/>
+        </w:rPr>
+        <w:t xml:space="preserve">&lt;Void&gt; </w:t>
+      </w:r>
+      <w:proofErr w:type="spellStart"/>
+      <w:proofErr w:type="gramStart"/>
+      <w:r>
+        <w:rPr>
+          <w:lang w:val="en-US"/>
+        </w:rPr>
+        <w:t>deleteEmployee</w:t>
+      </w:r>
+      <w:proofErr w:type="spellEnd"/>
+      <w:r>
+        <w:rPr>
+          <w:lang w:val="en-US"/>
+        </w:rPr>
+        <w:t>(</w:t>
+      </w:r>
+      <w:proofErr w:type="gramEnd"/>
+      <w:r>
+        <w:rPr>
+          <w:lang w:val="en-US"/>
+        </w:rPr>
+        <w:t xml:space="preserve">@PathVariable Long </w:t>
+      </w:r>
+      <w:proofErr w:type="gramStart"/>
+      <w:r>
+        <w:rPr>
+          <w:lang w:val="en-US"/>
+        </w:rPr>
+        <w:t>id) {</w:t>
+      </w:r>
+      <w:proofErr w:type="gramEnd"/>
+    </w:p>
+    <w:p>
+      <w:pPr>
+        <w:rPr>
+          <w:lang w:val="en-US"/>
+        </w:rPr>
+      </w:pPr>
+    </w:p>
+    <w:p>
+      <w:pPr>
+        <w:rPr>
+          <w:lang w:val="en-US"/>
+        </w:rPr>
+      </w:pPr>
+      <w:r>
+        <w:rPr>
+          <w:lang w:val="en-US"/>
+        </w:rPr>
+        <w:t xml:space="preserve">        if </w:t>
+      </w:r>
+      <w:proofErr w:type="gramStart"/>
+      <w:r>
+        <w:rPr>
+          <w:lang w:val="en-US"/>
+        </w:rPr>
+        <w:t>(!</w:t>
+      </w:r>
+      <w:proofErr w:type="spellStart"/>
+      <w:r>
+        <w:rPr>
+          <w:lang w:val="en-US"/>
+        </w:rPr>
+        <w:t>employeeService.existsById</w:t>
+      </w:r>
+      <w:proofErr w:type="spellEnd"/>
+      <w:proofErr w:type="gramEnd"/>
+      <w:r>
+        <w:rPr>
+          <w:lang w:val="en-US"/>
+        </w:rPr>
+        <w:t>(id</w:t>
+      </w:r>
+      <w:proofErr w:type="gramStart"/>
+      <w:r>
+        <w:rPr>
+          <w:lang w:val="en-US"/>
+        </w:rPr>
+        <w:t>)) {</w:t>
+      </w:r>
+      <w:proofErr w:type="gramEnd"/>
+    </w:p>
+    <w:p>
+      <w:pPr>
+        <w:rPr>
+          <w:lang w:val="en-US"/>
+        </w:rPr>
+      </w:pPr>
+      <w:r>
+        <w:rPr>
+          <w:lang w:val="en-US"/>
+        </w:rPr>
+        <w:t xml:space="preserve">            return </w:t>
+      </w:r>
+      <w:proofErr w:type="spellStart"/>
+      <w:r>
+        <w:rPr>
+          <w:lang w:val="en-US"/>
+        </w:rPr>
+        <w:t>ResponseEntity.notFound</w:t>
+      </w:r>
+      <w:proofErr w:type="spellEnd"/>
+      <w:r>
+        <w:rPr>
+          <w:lang w:val="en-US"/>
+        </w:rPr>
+        <w:t>(</w:t>
+      </w:r>
+      <w:proofErr w:type="gramStart"/>
+      <w:r>
+        <w:rPr>
+          <w:lang w:val="en-US"/>
+        </w:rPr>
+        <w:t>).build</w:t>
+      </w:r>
+      <w:proofErr w:type="gramEnd"/>
+      <w:r>
+        <w:rPr>
+          <w:lang w:val="en-US"/>
+        </w:rPr>
+        <w:t>(); // 404</w:t>
+      </w:r>
+    </w:p>
+    <w:p>
+      <w:pPr>
+        <w:rPr>
+          <w:lang w:val="en-US"/>
+        </w:rPr>
+      </w:pPr>
+      <w:r>
+        <w:rPr>
+          <w:lang w:val="en-US"/>
+        </w:rPr>
+        <w:t xml:space="preserve">        }</w:t>
+      </w:r>
+    </w:p>
+    <w:p>
+      <w:pPr>
+        <w:rPr>
+          <w:lang w:val="en-US"/>
+        </w:rPr>
+      </w:pPr>
+    </w:p>
+    <w:p>
+      <w:pPr>
+        <w:rPr>
+          <w:lang w:val="en-US"/>
+        </w:rPr>
+      </w:pPr>
+      <w:r>
+        <w:rPr>
+          <w:lang w:val="en-US"/>
+        </w:rPr>
+        <w:lastRenderedPageBreak/>
+        <w:t xml:space="preserve">        </w:t>
+      </w:r>
+      <w:proofErr w:type="spellStart"/>
+      <w:r>
+        <w:rPr>
+          <w:lang w:val="en-US"/>
+        </w:rPr>
+        <w:t>employeeService.deleteById</w:t>
+      </w:r>
+      <w:proofErr w:type="spellEnd"/>
+      <w:r>
+        <w:rPr>
+          <w:lang w:val="en-US"/>
+        </w:rPr>
+        <w:t>(id);</w:t>
+      </w:r>
+    </w:p>
+    <w:p>
+      <w:pPr>
+        <w:rPr>
+          <w:lang w:val="en-US"/>
+        </w:rPr>
+      </w:pPr>
+      <w:r>
+        <w:rPr>
+          <w:lang w:val="en-US"/>
+        </w:rPr>
+        <w:t xml:space="preserve">        </w:t>
+      </w:r>
+      <w:proofErr w:type="gramStart"/>
+      <w:r>
+        <w:rPr>
+          <w:lang w:val="en-US"/>
+        </w:rPr>
+        <w:t>return</w:t>
+      </w:r>
+      <w:proofErr w:type="gramEnd"/>
+      <w:r>
+        <w:rPr>
+          <w:lang w:val="en-US"/>
+        </w:rPr>
+        <w:t xml:space="preserve"> </w:t>
+      </w:r>
+      <w:proofErr w:type="spellStart"/>
+      <w:r>
+        <w:rPr>
+          <w:lang w:val="en-US"/>
+        </w:rPr>
+        <w:t>ResponseEntity.noContent</w:t>
+      </w:r>
+      <w:proofErr w:type="spellEnd"/>
+      <w:r>
+        <w:rPr>
+          <w:lang w:val="en-US"/>
+        </w:rPr>
+        <w:t>(</w:t>
+      </w:r>
+      <w:proofErr w:type="gramStart"/>
+      <w:r>
+        <w:rPr>
+          <w:lang w:val="en-US"/>
+        </w:rPr>
+        <w:t>).build</w:t>
+      </w:r>
+      <w:proofErr w:type="gramEnd"/>
+      <w:r>
+        <w:rPr>
+          <w:lang w:val="en-US"/>
+        </w:rPr>
+        <w:t>(); // 204</w:t>
+      </w:r>
+    </w:p>
+    <w:p>
+      <w:pPr>
+        <w:rPr>
+          <w:lang w:val="en-US"/>
+        </w:rPr>
+      </w:pPr>
+      <w:r>
+        <w:rPr>
+          <w:lang w:val="en-US"/>
+        </w:rPr>
+        <w:t xml:space="preserve">    }</w:t>
+      </w:r>
+    </w:p>
+    <w:p>
+      <w:pPr>
+        <w:rPr>
+          <w:lang w:val="en-US"/>
+        </w:rPr>
+      </w:pPr>
+      <w:r>
+        <w:rPr>
+          <w:lang w:val="en-US"/>
+        </w:rPr>
+        <w:t>}</w:t>
+      </w:r>
+    </w:p>
+    <w:p>
+      <w:pPr>
+        <w:pStyle w:val="Heading2"/>
+      </w:pPr>
+      <w:r>
+        <w:t xml:space="preserve">Idempotent vs </w:t>
+      </w:r>
+      <w:proofErr w:type="gramStart"/>
+      <w:r>
+        <w:t>Non-Idempotent</w:t>
+      </w:r>
+      <w:proofErr w:type="gramEnd"/>
+    </w:p>
+    <w:p>
       <w:r>
         <w:rPr>
           <w:b/>
           <w:bCs/>
         </w:rPr>
+        <w:t>Idempotent:</w:t>
+      </w:r>
+      <w:r>
+        <w:t xml:space="preserve"> Calling the API multiple times produces the same </w:t>
+      </w:r>
+      <w:proofErr w:type="gramStart"/>
+      <w:r>
+        <w:t>end result</w:t>
+      </w:r>
+      <w:proofErr w:type="gramEnd"/>
+      <w:r>
+        <w:t xml:space="preserve"> on the server.</w:t>
+      </w:r>
+    </w:p>
+    <w:p>
+      <w:r>
+        <w:rPr>
+          <w:b/>
+          <w:bCs/>
+        </w:rPr>
+        <w:t>Non-Idempotent:</w:t>
+      </w:r>
+      <w:r>
+        <w:t xml:space="preserve"> Calling the API multiple times changes the state each time.</w:t>
+      </w:r>
+    </w:p>
+    <w:p/>
+    <w:p/>
+    <w:p/>
+    <w:p/>
+    <w:p/>
+    <w:p/>
+    <w:p>
+      <w:pPr>
+        <w:rPr>
+          <w:b/>
+          <w:bCs/>
+        </w:rPr>
+      </w:pPr>
+      <w:r>
+        <w:rPr>
+          <w:b/>
+          <w:bCs/>
+        </w:rPr>
+        <w:t xml:space="preserve">In </w:t>
+      </w:r>
+      <w:r>
+        <w:rPr>
+          <w:b/>
+          <w:bCs/>
+        </w:rPr>
+        <w:t>this</w:t>
+      </w:r>
+      <w:r>
+        <w:rPr>
+          <w:b/>
+          <w:bCs/>
+        </w:rPr>
+        <w:t xml:space="preserve"> Employee CRUD APIs</w:t>
+      </w:r>
+    </w:p>
+    <w:tbl>
+      <w:tblPr>
+        <w:tblW w:w="0" w:type="auto"/>
+        <w:tblCellSpacing w:w="15" w:type="dxa"/>
+        <w:tblCellMar>
+          <w:top w:w="15" w:type="dxa"/>
+          <w:left w:w="15" w:type="dxa"/>
+          <w:bottom w:w="15" w:type="dxa"/>
+          <w:right w:w="15" w:type="dxa"/>
+        </w:tblCellMar>
+        <w:tblLook w:val="04A0" w:firstRow="1" w:lastRow="0" w:firstColumn="1" w:lastColumn="0" w:noHBand="0" w:noVBand="1"/>
+      </w:tblPr>
+      <w:tblGrid>
+        <w:gridCol w:w="1515"/>
+        <w:gridCol w:w="2198"/>
+        <w:gridCol w:w="1727"/>
+        <w:gridCol w:w="3570"/>
+      </w:tblGrid>
+      <w:tr>
+        <w:trPr>
+          <w:tblCellSpacing w:w="15" w:type="dxa"/>
+        </w:trPr>
+        <w:tc>
+          <w:tcPr>
+            <w:tcW w:w="0" w:type="auto"/>
+            <w:tcBorders>
+              <w:top w:val="single" w:sz="6" w:space="0" w:color="E6E6E6"/>
+              <w:left w:val="single" w:sz="6" w:space="0" w:color="E6E6E6"/>
+              <w:bottom w:val="single" w:sz="6" w:space="0" w:color="E6E6E6"/>
+              <w:right w:val="single" w:sz="6" w:space="0" w:color="E6E6E6"/>
+            </w:tcBorders>
+            <w:shd w:val="clear" w:color="auto" w:fill="F5F5F5"/>
+            <w:vAlign w:val="center"/>
+            <w:hideMark/>
+          </w:tcPr>
+          <w:p>
+            <w:pPr>
+              <w:rPr>
+                <w:b/>
+                <w:bCs/>
+              </w:rPr>
+            </w:pPr>
+            <w:r>
+              <w:rPr>
+                <w:b/>
+                <w:bCs/>
+              </w:rPr>
+              <w:t>API</w:t>
+            </w:r>
+          </w:p>
+        </w:tc>
+        <w:tc>
+          <w:tcPr>
+            <w:tcW w:w="0" w:type="auto"/>
+            <w:tcBorders>
+              <w:top w:val="single" w:sz="6" w:space="0" w:color="E6E6E6"/>
+              <w:left w:val="single" w:sz="6" w:space="0" w:color="E6E6E6"/>
+              <w:bottom w:val="single" w:sz="6" w:space="0" w:color="E6E6E6"/>
+              <w:right w:val="single" w:sz="6" w:space="0" w:color="E6E6E6"/>
+            </w:tcBorders>
+            <w:shd w:val="clear" w:color="auto" w:fill="F5F5F5"/>
+            <w:vAlign w:val="center"/>
+            <w:hideMark/>
+          </w:tcPr>
+          <w:p>
+            <w:pPr>
+              <w:rPr>
+                <w:b/>
+                <w:bCs/>
+              </w:rPr>
+            </w:pPr>
+            <w:r>
+              <w:rPr>
+                <w:b/>
+                <w:bCs/>
+              </w:rPr>
+              <w:t>Method</w:t>
+            </w:r>
+          </w:p>
+        </w:tc>
+        <w:tc>
+          <w:tcPr>
+            <w:tcW w:w="0" w:type="auto"/>
+            <w:tcBorders>
+              <w:top w:val="single" w:sz="6" w:space="0" w:color="E6E6E6"/>
+              <w:left w:val="single" w:sz="6" w:space="0" w:color="E6E6E6"/>
+              <w:bottom w:val="single" w:sz="6" w:space="0" w:color="E6E6E6"/>
+              <w:right w:val="single" w:sz="6" w:space="0" w:color="E6E6E6"/>
+            </w:tcBorders>
+            <w:shd w:val="clear" w:color="auto" w:fill="F5F5F5"/>
+            <w:vAlign w:val="center"/>
+            <w:hideMark/>
+          </w:tcPr>
+          <w:p>
+            <w:pPr>
+              <w:rPr>
+                <w:b/>
+                <w:bCs/>
+              </w:rPr>
+            </w:pPr>
+            <w:r>
+              <w:rPr>
+                <w:b/>
+                <w:bCs/>
+              </w:rPr>
+              <w:t>Idempotent?</w:t>
+            </w:r>
+          </w:p>
+        </w:tc>
+        <w:tc>
+          <w:tcPr>
+            <w:tcW w:w="0" w:type="auto"/>
+            <w:tcBorders>
+              <w:top w:val="single" w:sz="6" w:space="0" w:color="E6E6E6"/>
+              <w:left w:val="single" w:sz="6" w:space="0" w:color="E6E6E6"/>
+              <w:bottom w:val="single" w:sz="6" w:space="0" w:color="E6E6E6"/>
+              <w:right w:val="single" w:sz="6" w:space="0" w:color="E6E6E6"/>
+            </w:tcBorders>
+            <w:shd w:val="clear" w:color="auto" w:fill="F5F5F5"/>
+            <w:vAlign w:val="center"/>
+            <w:hideMark/>
+          </w:tcPr>
+          <w:p>
+            <w:pPr>
+              <w:rPr>
+                <w:b/>
+                <w:bCs/>
+              </w:rPr>
+            </w:pPr>
+            <w:r>
+              <w:rPr>
+                <w:b/>
+                <w:bCs/>
+              </w:rPr>
+              <w:t>Why?</w:t>
+            </w:r>
+          </w:p>
+        </w:tc>
+      </w:tr>
+      <w:tr>
+        <w:trPr>
+          <w:tblCellSpacing w:w="15" w:type="dxa"/>
+        </w:trPr>
+        <w:tc>
+          <w:tcPr>
+            <w:tcW w:w="0" w:type="auto"/>
+            <w:tcBorders>
+              <w:top w:val="single" w:sz="6" w:space="0" w:color="E6E6E6"/>
+              <w:left w:val="single" w:sz="6" w:space="0" w:color="E6E6E6"/>
+              <w:bottom w:val="single" w:sz="6" w:space="0" w:color="E6E6E6"/>
+              <w:right w:val="single" w:sz="6" w:space="0" w:color="E6E6E6"/>
+            </w:tcBorders>
+            <w:vAlign w:val="center"/>
+            <w:hideMark/>
+          </w:tcPr>
+          <w:p>
+            <w:r>
+              <w:t>Create Employee</w:t>
+            </w:r>
+          </w:p>
+        </w:tc>
+        <w:tc>
+          <w:tcPr>
+            <w:tcW w:w="0" w:type="auto"/>
+            <w:tcBorders>
+              <w:top w:val="single" w:sz="6" w:space="0" w:color="E6E6E6"/>
+              <w:left w:val="single" w:sz="6" w:space="0" w:color="E6E6E6"/>
+              <w:bottom w:val="single" w:sz="6" w:space="0" w:color="E6E6E6"/>
+              <w:right w:val="single" w:sz="6" w:space="0" w:color="E6E6E6"/>
+            </w:tcBorders>
+            <w:vAlign w:val="center"/>
+            <w:hideMark/>
+          </w:tcPr>
+          <w:p>
+            <w:r>
+              <w:t>POST /employees</w:t>
+            </w:r>
+          </w:p>
+        </w:tc>
+        <w:tc>
+          <w:tcPr>
+            <w:tcW w:w="0" w:type="auto"/>
+            <w:tcBorders>
+              <w:top w:val="single" w:sz="6" w:space="0" w:color="E6E6E6"/>
+              <w:left w:val="single" w:sz="6" w:space="0" w:color="E6E6E6"/>
+              <w:bottom w:val="single" w:sz="6" w:space="0" w:color="E6E6E6"/>
+              <w:right w:val="single" w:sz="6" w:space="0" w:color="E6E6E6"/>
+            </w:tcBorders>
+            <w:vAlign w:val="center"/>
+            <w:hideMark/>
+          </w:tcPr>
+          <w:p>
+            <w:r>
+              <w:rPr>
+                <w:rFonts w:ascii="Segoe UI Emoji" w:hAnsi="Segoe UI Emoji" w:cs="Segoe UI Emoji"/>
+              </w:rPr>
+              <w:t>❌</w:t>
+            </w:r>
+            <w:r>
+              <w:t xml:space="preserve"> No</w:t>
+            </w:r>
+          </w:p>
+        </w:tc>
+        <w:tc>
+          <w:tcPr>
+            <w:tcW w:w="0" w:type="auto"/>
+            <w:tcBorders>
+              <w:top w:val="single" w:sz="6" w:space="0" w:color="E6E6E6"/>
+              <w:left w:val="single" w:sz="6" w:space="0" w:color="E6E6E6"/>
+              <w:bottom w:val="single" w:sz="6" w:space="0" w:color="E6E6E6"/>
+              <w:right w:val="single" w:sz="6" w:space="0" w:color="E6E6E6"/>
+            </w:tcBorders>
+            <w:vAlign w:val="center"/>
+            <w:hideMark/>
+          </w:tcPr>
+          <w:p>
+            <w:r>
+              <w:t>Each call creates a new employee.</w:t>
+            </w:r>
+          </w:p>
+        </w:tc>
+      </w:tr>
+      <w:tr>
+        <w:trPr>
+          <w:tblCellSpacing w:w="15" w:type="dxa"/>
+        </w:trPr>
+        <w:tc>
+          <w:tcPr>
+            <w:tcW w:w="0" w:type="auto"/>
+            <w:tcBorders>
+              <w:top w:val="single" w:sz="6" w:space="0" w:color="E6E6E6"/>
+              <w:left w:val="single" w:sz="6" w:space="0" w:color="E6E6E6"/>
+              <w:bottom w:val="single" w:sz="6" w:space="0" w:color="E6E6E6"/>
+              <w:right w:val="single" w:sz="6" w:space="0" w:color="E6E6E6"/>
+            </w:tcBorders>
+            <w:vAlign w:val="center"/>
+            <w:hideMark/>
+          </w:tcPr>
+          <w:p>
+            <w:r>
+              <w:t>Get Employee</w:t>
+            </w:r>
+          </w:p>
+        </w:tc>
+        <w:tc>
+          <w:tcPr>
+            <w:tcW w:w="0" w:type="auto"/>
+            <w:tcBorders>
+              <w:top w:val="single" w:sz="6" w:space="0" w:color="E6E6E6"/>
+              <w:left w:val="single" w:sz="6" w:space="0" w:color="E6E6E6"/>
+              <w:bottom w:val="single" w:sz="6" w:space="0" w:color="E6E6E6"/>
+              <w:right w:val="single" w:sz="6" w:space="0" w:color="E6E6E6"/>
+            </w:tcBorders>
+            <w:vAlign w:val="center"/>
+            <w:hideMark/>
+          </w:tcPr>
+          <w:p>
+            <w:r>
+              <w:t>GET /employees/{id}</w:t>
+            </w:r>
+          </w:p>
+        </w:tc>
+        <w:tc>
+          <w:tcPr>
+            <w:tcW w:w="0" w:type="auto"/>
+            <w:tcBorders>
+              <w:top w:val="single" w:sz="6" w:space="0" w:color="E6E6E6"/>
+              <w:left w:val="single" w:sz="6" w:space="0" w:color="E6E6E6"/>
+              <w:bottom w:val="single" w:sz="6" w:space="0" w:color="E6E6E6"/>
+              <w:right w:val="single" w:sz="6" w:space="0" w:color="E6E6E6"/>
+            </w:tcBorders>
+            <w:vAlign w:val="center"/>
+            <w:hideMark/>
+          </w:tcPr>
+          <w:p>
+            <w:r>
+              <w:rPr>
+                <w:rFonts w:ascii="Segoe UI Emoji" w:hAnsi="Segoe UI Emoji" w:cs="Segoe UI Emoji"/>
+              </w:rPr>
+              <w:t>✅</w:t>
+            </w:r>
+            <w:r>
+              <w:t xml:space="preserve"> Yes</w:t>
+            </w:r>
+          </w:p>
+        </w:tc>
+        <w:tc>
+          <w:tcPr>
+            <w:tcW w:w="0" w:type="auto"/>
+            <w:tcBorders>
+              <w:top w:val="single" w:sz="6" w:space="0" w:color="E6E6E6"/>
+              <w:left w:val="single" w:sz="6" w:space="0" w:color="E6E6E6"/>
+              <w:bottom w:val="single" w:sz="6" w:space="0" w:color="E6E6E6"/>
+              <w:right w:val="single" w:sz="6" w:space="0" w:color="E6E6E6"/>
+            </w:tcBorders>
+            <w:vAlign w:val="center"/>
+            <w:hideMark/>
+          </w:tcPr>
+          <w:p>
+            <w:r>
+              <w:t>Only reads data, no state change.</w:t>
+            </w:r>
+          </w:p>
+        </w:tc>
+      </w:tr>
+      <w:tr>
+        <w:trPr>
+          <w:tblCellSpacing w:w="15" w:type="dxa"/>
+        </w:trPr>
+        <w:tc>
+          <w:tcPr>
+            <w:tcW w:w="0" w:type="auto"/>
+            <w:tcBorders>
+              <w:top w:val="single" w:sz="6" w:space="0" w:color="E6E6E6"/>
+              <w:left w:val="single" w:sz="6" w:space="0" w:color="E6E6E6"/>
+              <w:bottom w:val="single" w:sz="6" w:space="0" w:color="E6E6E6"/>
+              <w:right w:val="single" w:sz="6" w:space="0" w:color="E6E6E6"/>
+            </w:tcBorders>
+            <w:vAlign w:val="center"/>
+            <w:hideMark/>
+          </w:tcPr>
+          <w:p>
+            <w:r>
+              <w:t>Update Employee</w:t>
+            </w:r>
+          </w:p>
+        </w:tc>
+        <w:tc>
+          <w:tcPr>
+            <w:tcW w:w="0" w:type="auto"/>
+            <w:tcBorders>
+              <w:top w:val="single" w:sz="6" w:space="0" w:color="E6E6E6"/>
+              <w:left w:val="single" w:sz="6" w:space="0" w:color="E6E6E6"/>
+              <w:bottom w:val="single" w:sz="6" w:space="0" w:color="E6E6E6"/>
+              <w:right w:val="single" w:sz="6" w:space="0" w:color="E6E6E6"/>
+            </w:tcBorders>
+            <w:vAlign w:val="center"/>
+            <w:hideMark/>
+          </w:tcPr>
+          <w:p>
+            <w:r>
+              <w:t>PUT /employees/{id}</w:t>
+            </w:r>
+          </w:p>
+        </w:tc>
+        <w:tc>
+          <w:tcPr>
+            <w:tcW w:w="0" w:type="auto"/>
+            <w:tcBorders>
+              <w:top w:val="single" w:sz="6" w:space="0" w:color="E6E6E6"/>
+              <w:left w:val="single" w:sz="6" w:space="0" w:color="E6E6E6"/>
+              <w:bottom w:val="single" w:sz="6" w:space="0" w:color="E6E6E6"/>
+              <w:right w:val="single" w:sz="6" w:space="0" w:color="E6E6E6"/>
+            </w:tcBorders>
+            <w:vAlign w:val="center"/>
+            <w:hideMark/>
+          </w:tcPr>
+          <w:p>
+            <w:r>
+              <w:rPr>
+                <w:rFonts w:ascii="Segoe UI Emoji" w:hAnsi="Segoe UI Emoji" w:cs="Segoe UI Emoji"/>
+              </w:rPr>
+              <w:t>✅</w:t>
+            </w:r>
+            <w:r>
+              <w:t xml:space="preserve"> Yes</w:t>
+            </w:r>
+          </w:p>
+        </w:tc>
+        <w:tc>
+          <w:tcPr>
+            <w:tcW w:w="0" w:type="auto"/>
+            <w:tcBorders>
+              <w:top w:val="single" w:sz="6" w:space="0" w:color="E6E6E6"/>
+              <w:left w:val="single" w:sz="6" w:space="0" w:color="E6E6E6"/>
+              <w:bottom w:val="single" w:sz="6" w:space="0" w:color="E6E6E6"/>
+              <w:right w:val="single" w:sz="6" w:space="0" w:color="E6E6E6"/>
+            </w:tcBorders>
+            <w:vAlign w:val="center"/>
+            <w:hideMark/>
+          </w:tcPr>
+          <w:p>
+            <w:r>
+              <w:t>Updating with the same payload repeatedly results in the same final state.</w:t>
+            </w:r>
+          </w:p>
+        </w:tc>
+      </w:tr>
+      <w:tr>
+        <w:trPr>
+          <w:tblCellSpacing w:w="15" w:type="dxa"/>
+        </w:trPr>
+        <w:tc>
+          <w:tcPr>
+            <w:tcW w:w="0" w:type="auto"/>
+            <w:tcBorders>
+              <w:top w:val="single" w:sz="6" w:space="0" w:color="E6E6E6"/>
+              <w:left w:val="single" w:sz="6" w:space="0" w:color="E6E6E6"/>
+              <w:bottom w:val="single" w:sz="6" w:space="0" w:color="E6E6E6"/>
+              <w:right w:val="single" w:sz="6" w:space="0" w:color="E6E6E6"/>
+            </w:tcBorders>
+            <w:vAlign w:val="center"/>
+            <w:hideMark/>
+          </w:tcPr>
+          <w:p>
+            <w:r>
+              <w:t>Delete Employee</w:t>
+            </w:r>
+          </w:p>
+        </w:tc>
+        <w:tc>
+          <w:tcPr>
+            <w:tcW w:w="0" w:type="auto"/>
+            <w:tcBorders>
+              <w:top w:val="single" w:sz="6" w:space="0" w:color="E6E6E6"/>
+              <w:left w:val="single" w:sz="6" w:space="0" w:color="E6E6E6"/>
+              <w:bottom w:val="single" w:sz="6" w:space="0" w:color="E6E6E6"/>
+              <w:right w:val="single" w:sz="6" w:space="0" w:color="E6E6E6"/>
+            </w:tcBorders>
+            <w:vAlign w:val="center"/>
+            <w:hideMark/>
+          </w:tcPr>
+          <w:p>
+            <w:r>
+              <w:t>DELETE /employees/{id}</w:t>
+            </w:r>
+          </w:p>
+        </w:tc>
+        <w:tc>
+          <w:tcPr>
+            <w:tcW w:w="0" w:type="auto"/>
+            <w:tcBorders>
+              <w:top w:val="single" w:sz="6" w:space="0" w:color="E6E6E6"/>
+              <w:left w:val="single" w:sz="6" w:space="0" w:color="E6E6E6"/>
+              <w:bottom w:val="single" w:sz="6" w:space="0" w:color="E6E6E6"/>
+              <w:right w:val="single" w:sz="6" w:space="0" w:color="E6E6E6"/>
+            </w:tcBorders>
+            <w:vAlign w:val="center"/>
+            <w:hideMark/>
+          </w:tcPr>
+          <w:p>
+            <w:r>
+              <w:rPr>
+                <w:rFonts w:ascii="Segoe UI Emoji" w:hAnsi="Segoe UI Emoji" w:cs="Segoe UI Emoji"/>
+              </w:rPr>
+              <w:t>✅</w:t>
+            </w:r>
+            <w:r>
+              <w:t xml:space="preserve"> Yes</w:t>
+            </w:r>
+          </w:p>
+        </w:tc>
+        <w:tc>
+          <w:tcPr>
+            <w:tcW w:w="0" w:type="auto"/>
+            <w:tcBorders>
+              <w:top w:val="single" w:sz="6" w:space="0" w:color="E6E6E6"/>
+              <w:left w:val="single" w:sz="6" w:space="0" w:color="E6E6E6"/>
+              <w:bottom w:val="single" w:sz="6" w:space="0" w:color="E6E6E6"/>
+              <w:right w:val="single" w:sz="6" w:space="0" w:color="E6E6E6"/>
+            </w:tcBorders>
+            <w:vAlign w:val="center"/>
+            <w:hideMark/>
+          </w:tcPr>
+          <w:p>
+            <w:r>
+              <w:t>After the first delete, the employee remains deleted. Further deletes don't change the state.</w:t>
+            </w:r>
+          </w:p>
+        </w:tc>
+      </w:tr>
+    </w:tbl>
+    <w:p>
+      <w:pPr>
+        <w:rPr>
+          <w:lang w:val="en-US"/>
+        </w:rPr>
+      </w:pPr>
+    </w:p>
+    <w:p>
+      <w:pPr>
+        <w:pStyle w:val="Heading2"/>
+      </w:pPr>
+      <w:r>
+        <w:t>POST vs PUT vs PATCH</w:t>
+      </w:r>
+    </w:p>
+    <w:p>
+      <w:pPr>
+        <w:spacing w:before="100" w:beforeAutospacing="1" w:after="100" w:afterAutospacing="1" w:line="300" w:lineRule="atLeast"/>
+        <w:rPr>
+          <w:rFonts w:eastAsiaTheme="majorEastAsia" w:cstheme="majorBidi"/>
+          <w:b/>
+          <w:bCs/>
+          <w:szCs w:val="26"/>
+        </w:rPr>
+      </w:pPr>
+      <w:r>
+        <w:rPr>
+          <w:rFonts w:eastAsiaTheme="majorEastAsia" w:cstheme="majorBidi"/>
+          <w:szCs w:val="26"/>
+        </w:rPr>
+        <w:t>The key difference is</w:t>
+      </w:r>
+      <w:r>
+        <w:rPr>
+          <w:rFonts w:eastAsiaTheme="majorEastAsia" w:cstheme="majorBidi"/>
+          <w:b/>
+          <w:bCs/>
+          <w:szCs w:val="26"/>
+        </w:rPr>
+        <w:t xml:space="preserve"> Create vs Full Update vs Partial Update.</w:t>
+      </w:r>
+    </w:p>
+    <w:p>
+      <w:pPr>
+        <w:rPr>
+          <w:b/>
+          <w:bCs/>
+        </w:rPr>
+      </w:pPr>
+      <w:r>
+        <w:rPr>
+          <w:b/>
+          <w:bCs/>
+        </w:rPr>
+        <w:t>POST → Create a new resource</w:t>
+      </w:r>
+    </w:p>
+    <w:p>
+      <w:r>
+        <w:t>POST /employees</w:t>
+      </w:r>
+    </w:p>
+    <w:p>
+      <w:r>
+        <w:t>Request:</w:t>
+      </w:r>
+    </w:p>
+    <w:p>
+      <w:r>
+        <w:t>{</w:t>
+      </w:r>
+    </w:p>
+    <w:p>
+      <w:r>
+        <w:t>"name": "John",</w:t>
+      </w:r>
+    </w:p>
+    <w:p>
+      <w:r>
+        <w:t>"department": "IT",</w:t>
+      </w:r>
+    </w:p>
+    <w:p>
+      <w:r>
+        <w:t>"salary": 50000</w:t>
+      </w:r>
+    </w:p>
+    <w:p>
+      <w:r>
+        <w:t>}</w:t>
+      </w:r>
+    </w:p>
+    <w:p>
+      <w:pPr>
+        <w:rPr>
+          <w:lang w:val="en-US"/>
+        </w:rPr>
+      </w:pPr>
+    </w:p>
+    <w:p>
+      <w:pPr>
+        <w:rPr>
+          <w:lang w:val="en-US"/>
+        </w:rPr>
+      </w:pPr>
+    </w:p>
+    <w:p>
+      <w:pPr>
+        <w:rPr>
+          <w:lang w:val="en-US"/>
+        </w:rPr>
+      </w:pPr>
+    </w:p>
+    <w:p>
+      <w:r>
+        <w:t>Result:</w:t>
+      </w:r>
+    </w:p>
+    <w:p>
+      <w:r>
+        <w:t>{</w:t>
+      </w:r>
+    </w:p>
+    <w:p>
+      <w:r>
+        <w:t>"id": 101,</w:t>
+      </w:r>
+    </w:p>
+    <w:p>
+      <w:r>
+        <w:t>"name": "John",</w:t>
+      </w:r>
+    </w:p>
+    <w:p>
+      <w:r>
+        <w:t>"department": "IT",</w:t>
+      </w:r>
+    </w:p>
+    <w:p>
+      <w:r>
+        <w:t>"salary": 50000</w:t>
+      </w:r>
+    </w:p>
+    <w:p>
+      <w:r>
+        <w:t>}</w:t>
+      </w:r>
+    </w:p>
+    <w:p>
+      <w:r>
+        <w:rPr>
+          <w:rFonts w:ascii="Segoe UI Emoji" w:hAnsi="Segoe UI Emoji" w:cs="Segoe UI Emoji"/>
+        </w:rPr>
+        <w:t>✅</w:t>
+      </w:r>
+      <w:r>
+        <w:t xml:space="preserve"> Creates a new employee</w:t>
+      </w:r>
+      <w:r>
+        <w:br/>
+      </w:r>
+      <w:r>
+        <w:rPr>
+          <w:rFonts w:ascii="Segoe UI Emoji" w:hAnsi="Segoe UI Emoji" w:cs="Segoe UI Emoji"/>
+        </w:rPr>
+        <w:t>✅</w:t>
+      </w:r>
+      <w:r>
+        <w:t xml:space="preserve"> </w:t>
+      </w:r>
+      <w:proofErr w:type="gramStart"/>
+      <w:r>
+        <w:t>Non-idempotent</w:t>
+      </w:r>
+      <w:proofErr w:type="gramEnd"/>
+    </w:p>
+    <w:p>
+      <w:pPr>
+        <w:rPr>
+          <w:lang w:val="en-US"/>
+        </w:rPr>
+      </w:pPr>
+    </w:p>
+    <w:p>
+      <w:pPr>
+        <w:rPr>
+          <w:b/>
+          <w:bCs/>
+        </w:rPr>
+      </w:pPr>
+      <w:r>
+        <w:rPr>
+          <w:b/>
+          <w:bCs/>
+        </w:rPr>
+        <w:t>PUT → Full update (replace resource)</w:t>
+      </w:r>
+    </w:p>
+    <w:p>
+      <w:r>
+        <w:t>PUT /employees/101</w:t>
+      </w:r>
+    </w:p>
+    <w:p>
+      <w:pPr>
+        <w:rPr>
+          <w:u w:val="single"/>
+        </w:rPr>
+      </w:pPr>
+      <w:r>
+        <w:rPr>
+          <w:u w:val="single"/>
+        </w:rPr>
+        <w:lastRenderedPageBreak/>
+        <w:t>Request:</w:t>
+      </w:r>
+    </w:p>
+    <w:p>
+      <w:r>
+        <w:t>{</w:t>
+      </w:r>
+    </w:p>
+    <w:p>
+      <w:r>
+        <w:t>"name": "John Smith",</w:t>
+      </w:r>
+    </w:p>
+    <w:p>
+      <w:r>
+        <w:t>"department": "HR",</w:t>
+      </w:r>
+    </w:p>
+    <w:p>
+      <w:r>
+        <w:t>"salary": 60000</w:t>
+      </w:r>
+    </w:p>
+    <w:p>
+      <w:r>
+        <w:t>}</w:t>
+      </w:r>
+    </w:p>
+    <w:p/>
+    <w:p>
+      <w:pPr>
+        <w:rPr>
+          <w:u w:val="single"/>
+        </w:rPr>
+      </w:pPr>
+      <w:r>
+        <w:rPr>
+          <w:u w:val="single"/>
+        </w:rPr>
+        <w:t>Result:</w:t>
+      </w:r>
+    </w:p>
+    <w:p>
+      <w:r>
+        <w:t>{</w:t>
+      </w:r>
+    </w:p>
+    <w:p>
+      <w:r>
+        <w:t>"id": 101,</w:t>
+      </w:r>
+    </w:p>
+    <w:p>
+      <w:r>
+        <w:t>"name": "John Smith",</w:t>
+      </w:r>
+    </w:p>
+    <w:p>
+      <w:r>
+        <w:t>"department": "HR",</w:t>
+      </w:r>
+    </w:p>
+    <w:p>
+      <w:r>
+        <w:t>"salary": 60000</w:t>
+      </w:r>
+    </w:p>
+    <w:p>
+      <w:r>
+        <w:t>}</w:t>
+      </w:r>
+    </w:p>
+    <w:p>
+      <w:r>
+        <w:rPr>
+          <w:rFonts w:ascii="Segoe UI Emoji" w:hAnsi="Segoe UI Emoji" w:cs="Segoe UI Emoji"/>
+        </w:rPr>
+        <w:t>✅</w:t>
+      </w:r>
+      <w:r>
+        <w:t xml:space="preserve"> Sends the complete object</w:t>
+      </w:r>
+      <w:r>
+        <w:br/>
+      </w:r>
+      <w:r>
+        <w:rPr>
+          <w:rFonts w:ascii="Segoe UI Emoji" w:hAnsi="Segoe UI Emoji" w:cs="Segoe UI Emoji"/>
+        </w:rPr>
+        <w:t>✅</w:t>
+      </w:r>
+      <w:r>
+        <w:t xml:space="preserve"> Replaces the existing resource state</w:t>
+      </w:r>
+      <w:r>
+        <w:br/>
+      </w:r>
+      <w:r>
+        <w:rPr>
+          <w:rFonts w:ascii="Segoe UI Emoji" w:hAnsi="Segoe UI Emoji" w:cs="Segoe UI Emoji"/>
+        </w:rPr>
+        <w:t>✅</w:t>
+      </w:r>
+      <w:r>
+        <w:t xml:space="preserve"> Idempotent</w:t>
+      </w:r>
+    </w:p>
+    <w:p>
+      <w:pPr>
+        <w:rPr>
+          <w:lang w:val="en-US"/>
+        </w:rPr>
+      </w:pPr>
+    </w:p>
+    <w:p>
+      <w:pPr>
+        <w:rPr>
+          <w:b/>
+          <w:bCs/>
+        </w:rPr>
+      </w:pPr>
+      <w:r>
+        <w:rPr>
+          <w:b/>
+          <w:bCs/>
+        </w:rPr>
+        <w:t>PATCH → Partial update</w:t>
+      </w:r>
+    </w:p>
+    <w:p>
+      <w:r>
+        <w:t>PATCH /employees/101</w:t>
+      </w:r>
+    </w:p>
+    <w:p>
+      <w:r>
+        <w:t>Request:</w:t>
+      </w:r>
+    </w:p>
+    <w:p>
+      <w:r>
+        <w:t>{</w:t>
+      </w:r>
+    </w:p>
+    <w:p>
+      <w:r>
+        <w:t>"salary": 60000</w:t>
+      </w:r>
+    </w:p>
+    <w:p>
+      <w:r>
+        <w:t>}</w:t>
+      </w:r>
+    </w:p>
+    <w:p>
+      <w:pPr>
+        <w:rPr>
+          <w:lang w:val="en-US"/>
+        </w:rPr>
+      </w:pPr>
+    </w:p>
+    <w:p>
+      <w:r>
+        <w:t>Result:</w:t>
+      </w:r>
+    </w:p>
+    <w:p>
+      <w:r>
+        <w:t>{</w:t>
+      </w:r>
+    </w:p>
+    <w:p>
+      <w:r>
+        <w:lastRenderedPageBreak/>
+        <w:t>"id": 101,</w:t>
+      </w:r>
+    </w:p>
+    <w:p>
+      <w:r>
+        <w:t>"name": "John",</w:t>
+      </w:r>
+    </w:p>
+    <w:p>
+      <w:r>
+        <w:t>"department": "IT",</w:t>
+      </w:r>
+    </w:p>
+    <w:p>
+      <w:r>
+        <w:t>"salary": 60000</w:t>
+      </w:r>
+    </w:p>
+    <w:p>
+      <w:r>
+        <w:t>}</w:t>
+      </w:r>
+    </w:p>
+    <w:p>
+      <w:pPr>
+        <w:rPr>
+          <w:lang w:val="en-US"/>
+        </w:rPr>
+      </w:pPr>
+    </w:p>
+    <w:p>
+      <w:r>
+        <w:rPr>
+          <w:rFonts w:ascii="Segoe UI Emoji" w:hAnsi="Segoe UI Emoji" w:cs="Segoe UI Emoji"/>
+        </w:rPr>
+        <w:t>✅</w:t>
+      </w:r>
+      <w:r>
+        <w:t xml:space="preserve"> Only updates specified fields</w:t>
+      </w:r>
+      <w:r>
+        <w:br/>
+      </w:r>
+      <w:r>
+        <w:rPr>
+          <w:rFonts w:ascii="Segoe UI Emoji" w:hAnsi="Segoe UI Emoji" w:cs="Segoe UI Emoji"/>
+        </w:rPr>
+        <w:t>✅</w:t>
+      </w:r>
+      <w:r>
+        <w:t xml:space="preserve"> Other fields remain unchanged</w:t>
+      </w:r>
+      <w:r>
+        <w:br/>
+      </w:r>
+      <w:r>
+        <w:rPr>
+          <w:rFonts w:ascii="Segoe UI Emoji" w:hAnsi="Segoe UI Emoji" w:cs="Segoe UI Emoji"/>
+        </w:rPr>
+        <w:t>✅</w:t>
+      </w:r>
+      <w:r>
+        <w:t xml:space="preserve"> Typically idempotent when setting a value</w:t>
+      </w:r>
+    </w:p>
+    <w:p>
+      <w:pPr>
+        <w:rPr>
+          <w:lang w:val="en-US"/>
+        </w:rPr>
+      </w:pPr>
+    </w:p>
+    <w:p>
+      <w:pPr>
+        <w:rPr>
+          <w:lang w:val="en-US"/>
+        </w:rPr>
+      </w:pPr>
+    </w:p>
+    <w:p>
+      <w:pPr>
+        <w:pStyle w:val="Heading1"/>
+      </w:pPr>
+      <w:r>
+        <w:t xml:space="preserve">Inversion Of </w:t>
+      </w:r>
+      <w:r>
+        <w:t>Control (</w:t>
+      </w:r>
+      <w:r>
+        <w:t>IOC)</w:t>
+      </w:r>
+    </w:p>
+    <w:p>
+      <w:r>
+        <w:t xml:space="preserve">IoC means </w:t>
+      </w:r>
+      <w:r>
+        <w:rPr>
+          <w:b/>
+          <w:bCs/>
+        </w:rPr>
         <w:t>the control of creating and managing objects is transferred from your code to a framework (Spring)</w:t>
       </w:r>
       <w:r>
@@ -12829,12 +16148,15 @@
     </w:p>
     <w:p>
       <w:r>
-        <w:t> </w:t>
-      </w:r>
-    </w:p>
-    <w:p>
-      <w:r>
-        <w:t xml:space="preserve">Instead of you creating objects using the new keyword , With </w:t>
+        <w:t xml:space="preserve">Instead of you creating objects using the new </w:t>
+      </w:r>
+      <w:proofErr w:type="gramStart"/>
+      <w:r>
+        <w:t>keyword ,</w:t>
+      </w:r>
+      <w:proofErr w:type="gramEnd"/>
+      <w:r>
+        <w:t xml:space="preserve"> With </w:t>
       </w:r>
       <w:r>
         <w:rPr>
@@ -12910,7 +16232,6 @@
         <w:spacing w:line="278" w:lineRule="auto"/>
       </w:pPr>
       <w:r>
-        <w:lastRenderedPageBreak/>
         <w:t>Manages lifecycle</w:t>
       </w:r>
     </w:p>
@@ -12978,6 +16299,7 @@
     </w:p>
     <w:p>
       <w:r>
+        <w:lastRenderedPageBreak/>
         <w:t> </w:t>
       </w:r>
     </w:p>
@@ -13625,6 +16947,7 @@
         </w:rPr>
         <w:t xml:space="preserve">Engine </w:t>
       </w:r>
+      <w:proofErr w:type="gramStart"/>
       <w:r>
         <w:rPr>
           <w:rFonts w:ascii="Source Code Pro" w:eastAsia="Times New Roman" w:hAnsi="Source Code Pro" w:cs="Times New Roman"/>
@@ -13647,6 +16970,7 @@
         </w:rPr>
         <w:t>) {</w:t>
       </w:r>
+      <w:proofErr w:type="gramEnd"/>
     </w:p>
     <w:p>
       <w:pPr>
@@ -13836,7 +17160,6 @@
     </w:p>
     <w:p>
       <w:r>
-        <w:lastRenderedPageBreak/>
         <w:t xml:space="preserve">In Spring, you don't use the new keyword for your services or repositories. Instead, you define them as </w:t>
       </w:r>
       <w:r>
@@ -13910,6 +17233,7 @@
         <w:pStyle w:val="Heading1"/>
       </w:pPr>
       <w:r>
+        <w:lastRenderedPageBreak/>
         <w:t>Reflection in Java</w:t>
       </w:r>
     </w:p>
@@ -14260,7 +17584,6 @@
         <w:rPr>
           <w:lang w:val="en-US"/>
         </w:rPr>
-        <w:lastRenderedPageBreak/>
         <w:t> </w:t>
       </w:r>
     </w:p>
@@ -14457,6 +17780,7 @@
         <w:rPr>
           <w:lang w:val="en-US"/>
         </w:rPr>
+        <w:lastRenderedPageBreak/>
         <w:t>4. Access private field</w:t>
       </w:r>
     </w:p>
@@ -14716,7 +18040,6 @@
         <w:rPr>
           <w:lang w:val="en-US"/>
         </w:rPr>
-        <w:lastRenderedPageBreak/>
         <w:t>How Spring Performs DI using Reflection</w:t>
       </w:r>
     </w:p>
@@ -14861,6 +18184,7 @@
         <w:rPr>
           <w:lang w:val="en-US"/>
         </w:rPr>
+        <w:lastRenderedPageBreak/>
         <w:t>Spring calls the constructor via reflection:</w:t>
       </w:r>
     </w:p>
@@ -15324,7 +18648,6 @@
           <w:iCs/>
           <w:lang w:val="en-US"/>
         </w:rPr>
-        <w:lastRenderedPageBreak/>
         <w:t>method.invoke</w:t>
       </w:r>
       <w:proofErr w:type="spellEnd"/>
@@ -15533,6 +18856,7 @@
           <w:bCs/>
           <w:lang w:val="en-US"/>
         </w:rPr>
+        <w:lastRenderedPageBreak/>
         <w:t xml:space="preserve">Step </w:t>
       </w:r>
       <w:proofErr w:type="gramStart"/>
@@ -15796,161 +19120,161 @@
         <w:rPr>
           <w:lang w:val="en-US"/>
         </w:rPr>
+        <w:t>Servlet Filter</w:t>
+      </w:r>
+    </w:p>
+    <w:p>
+      <w:pPr>
+        <w:rPr>
+          <w:lang w:val="en-US"/>
+        </w:rPr>
+      </w:pPr>
+      <w:r>
+        <w:rPr>
+          <w:lang w:val="en-US"/>
+        </w:rPr>
+        <w:t xml:space="preserve">   │</w:t>
+      </w:r>
+    </w:p>
+    <w:p>
+      <w:pPr>
+        <w:rPr>
+          <w:lang w:val="en-US"/>
+        </w:rPr>
+      </w:pPr>
+      <w:r>
+        <w:rPr>
+          <w:lang w:val="en-US"/>
+        </w:rPr>
+        <w:t xml:space="preserve">   </w:t>
+      </w:r>
+      <w:r>
+        <w:rPr>
+          <w:rFonts w:ascii="Arial" w:hAnsi="Arial" w:cs="Arial"/>
+          <w:lang w:val="en-US"/>
+        </w:rPr>
+        <w:t>▼</w:t>
+      </w:r>
+    </w:p>
+    <w:p>
+      <w:pPr>
+        <w:rPr>
+          <w:lang w:val="en-US"/>
+        </w:rPr>
+      </w:pPr>
+      <w:proofErr w:type="spellStart"/>
+      <w:r>
+        <w:rPr>
+          <w:lang w:val="en-US"/>
+        </w:rPr>
+        <w:t>DispatcherServlet</w:t>
+      </w:r>
+      <w:proofErr w:type="spellEnd"/>
+    </w:p>
+    <w:p>
+      <w:pPr>
+        <w:rPr>
+          <w:lang w:val="en-US"/>
+        </w:rPr>
+      </w:pPr>
+      <w:r>
+        <w:rPr>
+          <w:lang w:val="en-US"/>
+        </w:rPr>
+        <w:t xml:space="preserve">   │</w:t>
+      </w:r>
+    </w:p>
+    <w:p>
+      <w:pPr>
+        <w:rPr>
+          <w:lang w:val="en-US"/>
+        </w:rPr>
+      </w:pPr>
+      <w:r>
+        <w:rPr>
+          <w:lang w:val="en-US"/>
+        </w:rPr>
+        <w:t xml:space="preserve">   </w:t>
+      </w:r>
+      <w:r>
+        <w:rPr>
+          <w:rFonts w:ascii="Arial" w:hAnsi="Arial" w:cs="Arial"/>
+          <w:lang w:val="en-US"/>
+        </w:rPr>
+        <w:t>▼</w:t>
+      </w:r>
+    </w:p>
+    <w:p>
+      <w:pPr>
+        <w:rPr>
+          <w:lang w:val="en-US"/>
+        </w:rPr>
+      </w:pPr>
+      <w:r>
+        <w:rPr>
+          <w:lang w:val="en-US"/>
+        </w:rPr>
+        <w:t>Interceptor (</w:t>
+      </w:r>
+      <w:proofErr w:type="spellStart"/>
+      <w:r>
+        <w:rPr>
+          <w:lang w:val="en-US"/>
+        </w:rPr>
+        <w:t>preHandle</w:t>
+      </w:r>
+      <w:proofErr w:type="spellEnd"/>
+      <w:r>
+        <w:rPr>
+          <w:lang w:val="en-US"/>
+        </w:rPr>
+        <w:t>)</w:t>
+      </w:r>
+    </w:p>
+    <w:p>
+      <w:pPr>
+        <w:rPr>
+          <w:lang w:val="en-US"/>
+        </w:rPr>
+      </w:pPr>
+      <w:r>
+        <w:rPr>
+          <w:lang w:val="en-US"/>
+        </w:rPr>
+        <w:t xml:space="preserve">   │</w:t>
+      </w:r>
+    </w:p>
+    <w:p>
+      <w:pPr>
+        <w:rPr>
+          <w:lang w:val="en-US"/>
+        </w:rPr>
+      </w:pPr>
+      <w:r>
+        <w:rPr>
+          <w:lang w:val="en-US"/>
+        </w:rPr>
+        <w:t xml:space="preserve">   </w:t>
+      </w:r>
+      <w:r>
+        <w:rPr>
+          <w:rFonts w:ascii="Arial" w:hAnsi="Arial" w:cs="Arial"/>
+          <w:lang w:val="en-US"/>
+        </w:rPr>
+        <w:t>▼</w:t>
+      </w:r>
+    </w:p>
+    <w:p>
+      <w:pPr>
+        <w:rPr>
+          <w:lang w:val="en-US"/>
+        </w:rPr>
+      </w:pPr>
+      <w:r>
+        <w:rPr>
+          <w:lang w:val="en-US"/>
+        </w:rPr>
         <w:lastRenderedPageBreak/>
-        <w:t>Servlet Filter</w:t>
-      </w:r>
-    </w:p>
-    <w:p>
-      <w:pPr>
-        <w:rPr>
-          <w:lang w:val="en-US"/>
-        </w:rPr>
-      </w:pPr>
-      <w:r>
-        <w:rPr>
-          <w:lang w:val="en-US"/>
-        </w:rPr>
-        <w:t xml:space="preserve">   │</w:t>
-      </w:r>
-    </w:p>
-    <w:p>
-      <w:pPr>
-        <w:rPr>
-          <w:lang w:val="en-US"/>
-        </w:rPr>
-      </w:pPr>
-      <w:r>
-        <w:rPr>
-          <w:lang w:val="en-US"/>
-        </w:rPr>
-        <w:t xml:space="preserve">   </w:t>
-      </w:r>
-      <w:r>
-        <w:rPr>
-          <w:rFonts w:ascii="Arial" w:hAnsi="Arial" w:cs="Arial"/>
-          <w:lang w:val="en-US"/>
-        </w:rPr>
-        <w:t>▼</w:t>
-      </w:r>
-    </w:p>
-    <w:p>
-      <w:pPr>
-        <w:rPr>
-          <w:lang w:val="en-US"/>
-        </w:rPr>
-      </w:pPr>
-      <w:proofErr w:type="spellStart"/>
-      <w:r>
-        <w:rPr>
-          <w:lang w:val="en-US"/>
-        </w:rPr>
-        <w:t>DispatcherServlet</w:t>
-      </w:r>
-      <w:proofErr w:type="spellEnd"/>
-    </w:p>
-    <w:p>
-      <w:pPr>
-        <w:rPr>
-          <w:lang w:val="en-US"/>
-        </w:rPr>
-      </w:pPr>
-      <w:r>
-        <w:rPr>
-          <w:lang w:val="en-US"/>
-        </w:rPr>
-        <w:t xml:space="preserve">   │</w:t>
-      </w:r>
-    </w:p>
-    <w:p>
-      <w:pPr>
-        <w:rPr>
-          <w:lang w:val="en-US"/>
-        </w:rPr>
-      </w:pPr>
-      <w:r>
-        <w:rPr>
-          <w:lang w:val="en-US"/>
-        </w:rPr>
-        <w:t xml:space="preserve">   </w:t>
-      </w:r>
-      <w:r>
-        <w:rPr>
-          <w:rFonts w:ascii="Arial" w:hAnsi="Arial" w:cs="Arial"/>
-          <w:lang w:val="en-US"/>
-        </w:rPr>
-        <w:t>▼</w:t>
-      </w:r>
-    </w:p>
-    <w:p>
-      <w:pPr>
-        <w:rPr>
-          <w:lang w:val="en-US"/>
-        </w:rPr>
-      </w:pPr>
-      <w:r>
-        <w:rPr>
-          <w:lang w:val="en-US"/>
-        </w:rPr>
-        <w:t>Interceptor (</w:t>
-      </w:r>
-      <w:proofErr w:type="spellStart"/>
-      <w:r>
-        <w:rPr>
-          <w:lang w:val="en-US"/>
-        </w:rPr>
-        <w:t>preHandle</w:t>
-      </w:r>
-      <w:proofErr w:type="spellEnd"/>
-      <w:r>
-        <w:rPr>
-          <w:lang w:val="en-US"/>
-        </w:rPr>
-        <w:t>)</w:t>
-      </w:r>
-    </w:p>
-    <w:p>
-      <w:pPr>
-        <w:rPr>
-          <w:lang w:val="en-US"/>
-        </w:rPr>
-      </w:pPr>
-      <w:r>
-        <w:rPr>
-          <w:lang w:val="en-US"/>
-        </w:rPr>
-        <w:t xml:space="preserve">   │</w:t>
-      </w:r>
-    </w:p>
-    <w:p>
-      <w:pPr>
-        <w:rPr>
-          <w:lang w:val="en-US"/>
-        </w:rPr>
-      </w:pPr>
-      <w:r>
-        <w:rPr>
-          <w:lang w:val="en-US"/>
-        </w:rPr>
-        <w:t xml:space="preserve">   </w:t>
-      </w:r>
-      <w:r>
-        <w:rPr>
-          <w:rFonts w:ascii="Arial" w:hAnsi="Arial" w:cs="Arial"/>
-          <w:lang w:val="en-US"/>
-        </w:rPr>
-        <w:t>▼</w:t>
-      </w:r>
-    </w:p>
-    <w:p>
-      <w:pPr>
-        <w:rPr>
-          <w:lang w:val="en-US"/>
-        </w:rPr>
-      </w:pPr>
-      <w:r>
-        <w:rPr>
-          <w:lang w:val="en-US"/>
-        </w:rPr>
         <w:t>Controller</w:t>
       </w:r>
     </w:p>
@@ -16340,6 +19664,7 @@
         <w:rPr>
           <w:lang w:val="en-US"/>
         </w:rPr>
+        <w:lastRenderedPageBreak/>
         <w:t>Performance monitoring</w:t>
       </w:r>
     </w:p>
@@ -16874,7 +20199,6 @@
         <w:rPr>
           <w:lang w:val="en-US"/>
         </w:rPr>
-        <w:lastRenderedPageBreak/>
         <w:t>2. Join Point</w:t>
       </w:r>
     </w:p>
@@ -17026,6 +20350,7 @@
         <w:rPr>
           <w:lang w:val="en-US"/>
         </w:rPr>
+        <w:lastRenderedPageBreak/>
         <w:t>@Around → wraps entire method (most powerful)</w:t>
       </w:r>
     </w:p>
@@ -17372,7 +20697,6 @@
         <w:rPr>
           <w:lang w:val="en-US"/>
         </w:rPr>
-        <w:lastRenderedPageBreak/>
         <w:t xml:space="preserve">Applies aspects </w:t>
       </w:r>
     </w:p>
@@ -17526,6 +20850,7 @@
           <w:u w:val="single"/>
           <w:lang w:val="en-US"/>
         </w:rPr>
+        <w:lastRenderedPageBreak/>
         <w:t>Proxy in Code</w:t>
       </w:r>
     </w:p>
@@ -18538,7 +21863,6 @@
           <w:lang w:val="en-US"/>
           <w14:ligatures w14:val="none"/>
         </w:rPr>
-        <w:lastRenderedPageBreak/>
         <w:t>}</w:t>
       </w:r>
     </w:p>
@@ -18868,6 +22192,7 @@
         <w:rPr>
           <w:lang w:val="en-US"/>
         </w:rPr>
+        <w:lastRenderedPageBreak/>
         <w:t xml:space="preserve">This is exactly what Spring does </w:t>
       </w:r>
       <w:r>
@@ -19833,7 +23158,6 @@
           <w:lang w:val="en-US"/>
           <w14:ligatures w14:val="none"/>
         </w:rPr>
-        <w:lastRenderedPageBreak/>
         <w:t xml:space="preserve">public </w:t>
       </w:r>
       <w:r>
@@ -20205,6 +23529,7 @@
         <w:pStyle w:val="Heading1"/>
       </w:pPr>
       <w:r>
+        <w:lastRenderedPageBreak/>
         <w:t>Transactional</w:t>
       </w:r>
     </w:p>
@@ -20803,7 +24128,6 @@
           <w:lang w:val="en-US"/>
           <w14:ligatures w14:val="none"/>
         </w:rPr>
-        <w:lastRenderedPageBreak/>
         <w:t>TransactionManager</w:t>
       </w:r>
       <w:proofErr w:type="spellEnd"/>
@@ -21654,6 +24978,7 @@
           <w:lang w:val="en-US"/>
           <w14:ligatures w14:val="none"/>
         </w:rPr>
+        <w:lastRenderedPageBreak/>
         <w:t> </w:t>
       </w:r>
     </w:p>
@@ -22134,7 +25459,6 @@
         <w:rPr>
           <w:lang w:val="en-US"/>
         </w:rPr>
-        <w:lastRenderedPageBreak/>
         <w:t>REQUIRED (default)</w:t>
       </w:r>
     </w:p>
@@ -22872,6 +26196,7 @@
         <w:rPr>
           <w:lang w:val="en-US"/>
         </w:rPr>
+        <w:lastRenderedPageBreak/>
         <w:t xml:space="preserve">        ↓</w:t>
       </w:r>
     </w:p>
@@ -22920,7 +26245,21 @@
         <w:rPr>
           <w:lang w:val="en-US"/>
         </w:rPr>
-        <w:t>):  Rollback EVERYTHING (both methods)</w:t>
+        <w:t>)</w:t>
+      </w:r>
+      <w:proofErr w:type="gramStart"/>
+      <w:r>
+        <w:rPr>
+          <w:lang w:val="en-US"/>
+        </w:rPr>
+        <w:t>:  Rollback</w:t>
+      </w:r>
+      <w:proofErr w:type="gramEnd"/>
+      <w:r>
+        <w:rPr>
+          <w:lang w:val="en-US"/>
+        </w:rPr>
+        <w:t xml:space="preserve"> EVERYTHING (both methods)</w:t>
       </w:r>
     </w:p>
     <w:p/>
@@ -23116,7 +26455,6 @@
         <w:rPr>
           <w:lang w:val="en-US"/>
         </w:rPr>
-        <w:lastRenderedPageBreak/>
         <w:t xml:space="preserve">        → TX2 starts</w:t>
       </w:r>
     </w:p>
@@ -23741,6 +27079,7 @@
           <w:lang w:val="en-US"/>
           <w14:ligatures w14:val="none"/>
         </w:rPr>
+        <w:lastRenderedPageBreak/>
         <w:t> </w:t>
       </w:r>
     </w:p>
@@ -24111,7 +27450,6 @@
           <w:lang w:val="en-US"/>
           <w14:ligatures w14:val="none"/>
         </w:rPr>
-        <w:lastRenderedPageBreak/>
         <w:t xml:space="preserve">Controls </w:t>
       </w:r>
       <w:r>
@@ -24572,6 +27910,7 @@
           <w:lang w:val="en-US"/>
           <w14:ligatures w14:val="none"/>
         </w:rPr>
+        <w:lastRenderedPageBreak/>
         <w:t>T1 updates balance = 500 (not committed)</w:t>
       </w:r>
     </w:p>
@@ -24948,7 +28287,6 @@
           <w:rFonts w:eastAsia="Times New Roman"/>
           <w:lang w:val="en-US"/>
         </w:rPr>
-        <w:lastRenderedPageBreak/>
         <w:t>REPEATABLE_READ</w:t>
       </w:r>
     </w:p>
@@ -25441,6 +28779,7 @@
           <w:lang w:val="en-US"/>
           <w14:ligatures w14:val="none"/>
         </w:rPr>
+        <w:lastRenderedPageBreak/>
         <w:t>T1: SELECT * FROM orders WHERE amount &gt; 100</w:t>
       </w:r>
     </w:p>
@@ -26328,6 +29667,7 @@
           <w:lang w:val="en-US"/>
           <w14:ligatures w14:val="none"/>
         </w:rPr>
+        <w:lastRenderedPageBreak/>
         <w:t xml:space="preserve">₹1000 added to B </w:t>
       </w:r>
     </w:p>
@@ -27000,7 +30340,6 @@
           <w:lang w:val="en-US"/>
           <w14:ligatures w14:val="none"/>
         </w:rPr>
-        <w:lastRenderedPageBreak/>
         <w:t> </w:t>
       </w:r>
     </w:p>
@@ -27413,6 +30752,7 @@
           <w:lang w:val="en-US"/>
           <w14:ligatures w14:val="none"/>
         </w:rPr>
+        <w:lastRenderedPageBreak/>
         <w:t> </w:t>
       </w:r>
     </w:p>
@@ -27653,7 +30993,6 @@
     </w:p>
     <w:p>
       <w:r>
-        <w:lastRenderedPageBreak/>
         <w:t>Each request from a client to a server must contain all the information needed to understand and process the request.</w:t>
       </w:r>
     </w:p>
@@ -27736,6 +31075,7 @@
     </w:p>
     <w:p>
       <w:r>
+        <w:lastRenderedPageBreak/>
         <w:t xml:space="preserve">RESTful APIs use a uniform interface, which includes HTTP methods (GET, POST, PUT, DELETE) and HTTP status codes. </w:t>
       </w:r>
     </w:p>
@@ -27848,7 +31188,6 @@
           <w:lang w:val="en-US"/>
           <w14:ligatures w14:val="none"/>
         </w:rPr>
-        <w:lastRenderedPageBreak/>
         <w:t> </w:t>
       </w:r>
     </w:p>
@@ -28734,6 +32073,7 @@
           <w:lang w:val="en-US"/>
           <w14:ligatures w14:val="none"/>
         </w:rPr>
+        <w:lastRenderedPageBreak/>
         <w:t> </w:t>
       </w:r>
     </w:p>
@@ -29213,7 +32553,6 @@
           <w:lang w:val="en-US"/>
           <w14:ligatures w14:val="none"/>
         </w:rPr>
-        <w:lastRenderedPageBreak/>
         <w:t>Saves memory and DB load if not used</w:t>
       </w:r>
     </w:p>
@@ -29722,6 +33061,7 @@
           <w:lang w:val="en-US"/>
           <w14:ligatures w14:val="none"/>
         </w:rPr>
+        <w:lastRenderedPageBreak/>
         <w:t> </w:t>
       </w:r>
     </w:p>
@@ -29812,7 +33152,18 @@
           <w:lang w:val="en-US"/>
           <w14:ligatures w14:val="none"/>
         </w:rPr>
-        <w:t>This triggers </w:t>
+        <w:t xml:space="preserve">This </w:t>
+      </w:r>
+      <w:proofErr w:type="gramStart"/>
+      <w:r>
+        <w:rPr>
+          <w:rFonts w:eastAsia="Times New Roman" w:cs="Times New Roman"/>
+          <w:kern w:val="0"/>
+          <w:szCs w:val="28"/>
+          <w:lang w:val="en-US"/>
+          <w14:ligatures w14:val="none"/>
+        </w:rPr>
+        <w:t>triggers </w:t>
       </w:r>
       <w:r>
         <w:rPr>
@@ -29827,6 +33178,7 @@
         </w:rPr>
         <w:t>N</w:t>
       </w:r>
+      <w:proofErr w:type="gramEnd"/>
       <w:r>
         <w:rPr>
           <w:rFonts w:eastAsia="Times New Roman" w:cs="Times New Roman"/>
@@ -30182,8 +33534,20 @@
           <w:lang w:val="en-US"/>
           <w14:ligatures w14:val="none"/>
         </w:rPr>
-        <w:t xml:space="preserve"> orders) {</w:t>
-      </w:r>
+        <w:t xml:space="preserve"> </w:t>
+      </w:r>
+      <w:proofErr w:type="gramStart"/>
+      <w:r>
+        <w:rPr>
+          <w:rFonts w:eastAsia="Times New Roman" w:cs="Times New Roman"/>
+          <w:kern w:val="0"/>
+          <w:szCs w:val="28"/>
+          <w:lang w:val="en-US"/>
+          <w14:ligatures w14:val="none"/>
+        </w:rPr>
+        <w:t>orders) {</w:t>
+      </w:r>
+      <w:proofErr w:type="gramEnd"/>
     </w:p>
     <w:p>
       <w:pPr>
@@ -30362,7 +33726,6 @@
           <w:lang w:val="en-US"/>
           <w14:ligatures w14:val="none"/>
         </w:rPr>
-        <w:lastRenderedPageBreak/>
         <w:t> </w:t>
       </w:r>
     </w:p>
@@ -30841,6 +34204,7 @@
           <w:lang w:val="en-US"/>
           <w14:ligatures w14:val="none"/>
         </w:rPr>
+        <w:lastRenderedPageBreak/>
         <w:t>@</w:t>
       </w:r>
       <w:proofErr w:type="gramStart"/>
@@ -31588,7 +34952,6 @@
           <w:rFonts w:eastAsia="Times New Roman"/>
           <w:lang w:val="en-US"/>
         </w:rPr>
-        <w:lastRenderedPageBreak/>
         <w:t>EntityGraph</w:t>
       </w:r>
       <w:proofErr w:type="spellEnd"/>
@@ -32096,6 +35459,7 @@
           <w:lang w:val="en-US"/>
           <w14:ligatures w14:val="none"/>
         </w:rPr>
+        <w:lastRenderedPageBreak/>
         <w:t> </w:t>
       </w:r>
     </w:p>
@@ -32677,6 +36041,7 @@
         </w:rPr>
         <w:t xml:space="preserve">attributePaths </w:t>
       </w:r>
+      <w:proofErr w:type="gramStart"/>
       <w:r>
         <w:rPr>
           <w:rFonts w:eastAsia="Times New Roman" w:cs="Times New Roman"/>
@@ -32708,7 +36073,19 @@
           <w:lang w:val="en-US"/>
           <w14:ligatures w14:val="none"/>
         </w:rPr>
-        <w:t>})</w:t>
+        <w:t>}</w:t>
+      </w:r>
+      <w:proofErr w:type="gramEnd"/>
+      <w:r>
+        <w:rPr>
+          <w:rFonts w:eastAsia="Times New Roman" w:cs="Times New Roman"/>
+          <w:color w:val="666666"/>
+          <w:kern w:val="0"/>
+          <w:szCs w:val="28"/>
+          <w:lang w:val="en-US"/>
+          <w14:ligatures w14:val="none"/>
+        </w:rPr>
+        <w:t>)</w:t>
       </w:r>
       <w:r>
         <w:rPr>
@@ -33000,7 +36377,6 @@
           <w:lang w:val="en-US"/>
           <w14:ligatures w14:val="none"/>
         </w:rPr>
-        <w:lastRenderedPageBreak/>
         <w:t xml:space="preserve">With </w:t>
       </w:r>
       <w:proofErr w:type="spellStart"/>
@@ -33526,6 +36902,7 @@
           <w:lang w:val="en-US"/>
           <w14:ligatures w14:val="none"/>
         </w:rPr>
+        <w:lastRenderedPageBreak/>
         <w:t xml:space="preserve">Order </w:t>
       </w:r>
       <w:proofErr w:type="spellStart"/>
@@ -34184,7 +37561,6 @@
           <w:lang w:val="en-US"/>
           <w14:ligatures w14:val="none"/>
         </w:rPr>
-        <w:lastRenderedPageBreak/>
         <w:t xml:space="preserve">Customer c2 = </w:t>
       </w:r>
       <w:proofErr w:type="spellStart"/>
@@ -34772,6 +38148,7 @@
           <w:rFonts w:eastAsia="Times New Roman"/>
           <w:lang w:val="en-US"/>
         </w:rPr>
+        <w:lastRenderedPageBreak/>
         <w:t>Basic API Design (</w:t>
       </w:r>
       <w:r>
@@ -35090,6 +38467,7 @@
           <w14:ligatures w14:val="none"/>
         </w:rPr>
       </w:pPr>
+      <w:proofErr w:type="gramStart"/>
       <w:r>
         <w:rPr>
           <w:rFonts w:eastAsia="Times New Roman" w:cs="Times New Roman"/>
@@ -35101,6 +38479,7 @@
         </w:rPr>
         <w:t>@GetMapping</w:t>
       </w:r>
+      <w:proofErr w:type="gramEnd"/>
       <w:r>
         <w:rPr>
           <w:rFonts w:eastAsia="Times New Roman" w:cs="Times New Roman"/>
@@ -35489,7 +38868,6 @@
           <w:lang w:val="en-US"/>
           <w14:ligatures w14:val="none"/>
         </w:rPr>
-        <w:lastRenderedPageBreak/>
         <w:t xml:space="preserve">Pageable </w:t>
       </w:r>
       <w:proofErr w:type="spellStart"/>
@@ -36121,6 +39499,7 @@
           <w:iCs/>
           <w:lang w:val="en-US"/>
         </w:rPr>
+        <w:lastRenderedPageBreak/>
         <w:t>/actuator/</w:t>
       </w:r>
       <w:proofErr w:type="spellStart"/>
@@ -36391,7 +39770,6 @@
         <w:rPr>
           <w:lang w:val="en-US"/>
         </w:rPr>
-        <w:lastRenderedPageBreak/>
         <w:t> </w:t>
       </w:r>
     </w:p>
@@ -36630,6 +40008,7 @@
         <w:rPr>
           <w:lang w:val="en-US"/>
         </w:rPr>
+        <w:lastRenderedPageBreak/>
         <w:t> </w:t>
       </w:r>
     </w:p>
@@ -37050,7 +40429,6 @@
         <w:rPr>
           <w:lang w:val="en-US"/>
         </w:rPr>
-        <w:lastRenderedPageBreak/>
         <w:t> </w:t>
       </w:r>
     </w:p>
@@ -37237,6 +40615,7 @@
         <w:rPr>
           <w:lang w:val="en-US"/>
         </w:rPr>
+        <w:lastRenderedPageBreak/>
         <w:t>Stores time-series metrics</w:t>
       </w:r>
     </w:p>
@@ -37738,7 +41117,6 @@
           <w:lang w:val="en-US"/>
           <w14:ligatures w14:val="none"/>
         </w:rPr>
-        <w:lastRenderedPageBreak/>
         <w:t> </w:t>
       </w:r>
     </w:p>
@@ -38299,6 +41677,7 @@
           <w:lang w:val="en-US"/>
           <w14:ligatures w14:val="none"/>
         </w:rPr>
+        <w:lastRenderedPageBreak/>
         <w:t xml:space="preserve">A handful of event-loop threads (Netty, by default) juggle thousands of connections. When a request waits on I/O, the thread isn't blocked — it goes and does other </w:t>
       </w:r>
       <w:proofErr w:type="gramStart"/>
@@ -38388,7 +41767,7 @@
 </file>
 
 <file path=word/numbering.xml><?xml version="1.0" encoding="utf-8"?>
-<w:numbering xmlns:wpc="http://schemas.microsoft.com/office/word/2010/wordprocessingCanvas" xmlns:cx="http://schemas.microsoft.com/office/drawing/2014/chartex" xmlns:cx1="http://schemas.microsoft.com/office/drawing/2015/9/8/chartex" xmlns:cx2="http://schemas.microsoft.com/office/drawing/2015/10/21/chartex" xmlns:cx3="http://schemas.microsoft.com/office/drawing/2016/5/9/chartex" xmlns:cx4="http://schemas.microsoft.com/office/drawing/2016/5/10/chartex" xmlns:cx5="http://schemas.microsoft.com/office/drawing/2016/5/11/chartex" xmlns:cx6="http://schemas.microsoft.com/office/drawing/2016/5/12/chartex" xmlns:cx7="http://schemas.microsoft.com/office/drawing/2016/5/13/chartex" xmlns:cx8="http://schemas.microsoft.com/office/drawing/2016/5/14/chartex" xmlns:mc="http://schemas.openxmlformats.org/markup-compatibility/2006" xmlns:m="http://schemas.openxmlformats.org/officeDocument/2006/math" xmlns:aink="http://schemas.microsoft.com/office/drawing/2016/ink" xmlns:am3d="http://schemas.microsoft.com/office/drawing/2017/model3d" xmlns:oel="http://schemas.microsoft.com/office/2019/extlst" xmlns:r="http://schemas.openxmlformats.org/officeDocument/2006/relationships" xmlns:wp14="http://schemas.microsoft.com/office/word/2010/wordprocessingDrawing" xmlns:wp="http://schemas.openxmlformats.org/drawingml/2006/wordprocessingDrawing" xmlns:wpg="http://schemas.microsoft.com/office/word/2010/wordprocessingGroup" xmlns:wpi="http://schemas.microsoft.com/office/word/2010/wordprocessingInk" xmlns:wps="http://schemas.microsoft.com/office/word/2010/wordprocessingShape" xmlns:o="urn:schemas-microsoft-com:office:office" xmlns:v="urn:schemas-microsoft-com:vml" xmlns:w10="urn:schemas-microsoft-com:office:word" xmlns:w="http://schemas.openxmlformats.org/wordprocessingml/2006/main" xmlns:w14="http://schemas.microsoft.com/office/word/2010/wordml" xmlns:w15="http://schemas.microsoft.com/office/word/2012/wordml" xmlns:w16cei="http://schemas.microsoft.com/office/word/2026/wordml/cei" xmlns:w16cex="http://schemas.microsoft.com/office/word/2018/wordml/cex" xmlns:w16cid="http://schemas.microsoft.com/office/word/2016/wordml/cid" xmlns:w16="http://schemas.microsoft.com/office/word/2018/wordml" xmlns:w16sdtdh="http://schemas.microsoft.com/office/word/2020/wordml/sdtdatahash" xmlns:w16sdtfl="http://schemas.microsoft.com/office/word/2024/wordml/sdtformatlock" xmlns:w16se="http://schemas.microsoft.com/office/word/2015/wordml/symex" xmlns:w16du="http://schemas.microsoft.com/office/word/2023/wordml/word16du" xmlns:wne="http://schemas.microsoft.com/office/word/2006/wordml" mc:Ignorable="w14 w15 w16se w16cid w16 w16cex w16sdtdh w16sdtfl w16du wp14">
+<w:numbering xmlns:wpc="http://schemas.microsoft.com/office/word/2010/wordprocessingCanvas" xmlns:cx="http://schemas.microsoft.com/office/drawing/2014/chartex" xmlns:cx1="http://schemas.microsoft.com/office/drawing/2015/9/8/chartex" xmlns:cx2="http://schemas.microsoft.com/office/drawing/2015/10/21/chartex" xmlns:cx3="http://schemas.microsoft.com/office/drawing/2016/5/9/chartex" xmlns:cx4="http://schemas.microsoft.com/office/drawing/2016/5/10/chartex" xmlns:cx5="http://schemas.microsoft.com/office/drawing/2016/5/11/chartex" xmlns:cx6="http://schemas.microsoft.com/office/drawing/2016/5/12/chartex" xmlns:cx7="http://schemas.microsoft.com/office/drawing/2016/5/13/chartex" xmlns:cx8="http://schemas.microsoft.com/office/drawing/2016/5/14/chartex" xmlns:mc="http://schemas.openxmlformats.org/markup-compatibility/2006" xmlns:aink="http://schemas.microsoft.com/office/drawing/2016/ink" xmlns:am3d="http://schemas.microsoft.com/office/drawing/2017/model3d" xmlns:o="urn:schemas-microsoft-com:office:office" xmlns:oel="http://schemas.microsoft.com/office/2019/extlst" xmlns:r="http://schemas.openxmlformats.org/officeDocument/2006/relationships" xmlns:m="http://schemas.openxmlformats.org/officeDocument/2006/math" xmlns:v="urn:schemas-microsoft-com:vml" xmlns:wp14="http://schemas.microsoft.com/office/word/2010/wordprocessingDrawing" xmlns:wp="http://schemas.openxmlformats.org/drawingml/2006/wordprocessingDrawing" xmlns:w10="urn:schemas-microsoft-com:office:word" xmlns:w="http://schemas.openxmlformats.org/wordprocessingml/2006/main" xmlns:w14="http://schemas.microsoft.com/office/word/2010/wordml" xmlns:w15="http://schemas.microsoft.com/office/word/2012/wordml" xmlns:w16cei="http://schemas.microsoft.com/office/word/2026/wordml/cei" xmlns:w16cex="http://schemas.microsoft.com/office/word/2018/wordml/cex" xmlns:w16cid="http://schemas.microsoft.com/office/word/2016/wordml/cid" xmlns:w16="http://schemas.microsoft.com/office/word/2018/wordml" xmlns:w16du="http://schemas.microsoft.com/office/word/2023/wordml/word16du" xmlns:w16sdtdh="http://schemas.microsoft.com/office/word/2020/wordml/sdtdatahash" xmlns:w16sdtfl="http://schemas.microsoft.com/office/word/2024/wordml/sdtformatlock" xmlns:w16se="http://schemas.microsoft.com/office/word/2015/wordml/symex" xmlns:wpg="http://schemas.microsoft.com/office/word/2010/wordprocessingGroup" xmlns:wpi="http://schemas.microsoft.com/office/word/2010/wordprocessingInk" xmlns:wne="http://schemas.microsoft.com/office/word/2006/wordml" xmlns:wps="http://schemas.microsoft.com/office/word/2010/wordprocessingShape" mc:Ignorable="w14 w15 w16se w16cid w16 w16cex w16sdtdh w16sdtfl w16du wp14">
   <w:abstractNum w:abstractNumId="0" w15:restartNumberingAfterBreak="0">
     <w:nsid w:val="02DC686C"/>
     <w:multiLevelType w:val="multilevel"/>
@@ -44099,6 +47478,119 @@
     </w:lvl>
   </w:abstractNum>
   <w:abstractNum w:abstractNumId="39" w15:restartNumberingAfterBreak="0">
+    <w:nsid w:val="4DCC58BE"/>
+    <w:multiLevelType w:val="multilevel"/>
+    <w:tmpl w:val="5230761C"/>
+    <w:lvl w:ilvl="0">
+      <w:start w:val="1"/>
+      <w:numFmt w:val="decimal"/>
+      <w:lvlText w:val="%1."/>
+      <w:lvlJc w:val="left"/>
+      <w:pPr>
+        <w:tabs>
+          <w:tab w:val="num" w:pos="720"/>
+        </w:tabs>
+        <w:ind w:left="720" w:hanging="360"/>
+      </w:pPr>
+    </w:lvl>
+    <w:lvl w:ilvl="1" w:tentative="1">
+      <w:start w:val="1"/>
+      <w:numFmt w:val="decimal"/>
+      <w:lvlText w:val="%2."/>
+      <w:lvlJc w:val="left"/>
+      <w:pPr>
+        <w:tabs>
+          <w:tab w:val="num" w:pos="1440"/>
+        </w:tabs>
+        <w:ind w:left="1440" w:hanging="360"/>
+      </w:pPr>
+    </w:lvl>
+    <w:lvl w:ilvl="2" w:tentative="1">
+      <w:start w:val="1"/>
+      <w:numFmt w:val="decimal"/>
+      <w:lvlText w:val="%3."/>
+      <w:lvlJc w:val="left"/>
+      <w:pPr>
+        <w:tabs>
+          <w:tab w:val="num" w:pos="2160"/>
+        </w:tabs>
+        <w:ind w:left="2160" w:hanging="360"/>
+      </w:pPr>
+    </w:lvl>
+    <w:lvl w:ilvl="3" w:tentative="1">
+      <w:start w:val="1"/>
+      <w:numFmt w:val="decimal"/>
+      <w:lvlText w:val="%4."/>
+      <w:lvlJc w:val="left"/>
+      <w:pPr>
+        <w:tabs>
+          <w:tab w:val="num" w:pos="2880"/>
+        </w:tabs>
+        <w:ind w:left="2880" w:hanging="360"/>
+      </w:pPr>
+    </w:lvl>
+    <w:lvl w:ilvl="4" w:tentative="1">
+      <w:start w:val="1"/>
+      <w:numFmt w:val="decimal"/>
+      <w:lvlText w:val="%5."/>
+      <w:lvlJc w:val="left"/>
+      <w:pPr>
+        <w:tabs>
+          <w:tab w:val="num" w:pos="3600"/>
+        </w:tabs>
+        <w:ind w:left="3600" w:hanging="360"/>
+      </w:pPr>
+    </w:lvl>
+    <w:lvl w:ilvl="5" w:tentative="1">
+      <w:start w:val="1"/>
+      <w:numFmt w:val="decimal"/>
+      <w:lvlText w:val="%6."/>
+      <w:lvlJc w:val="left"/>
+      <w:pPr>
+        <w:tabs>
+          <w:tab w:val="num" w:pos="4320"/>
+        </w:tabs>
+        <w:ind w:left="4320" w:hanging="360"/>
+      </w:pPr>
+    </w:lvl>
+    <w:lvl w:ilvl="6" w:tentative="1">
+      <w:start w:val="1"/>
+      <w:numFmt w:val="decimal"/>
+      <w:lvlText w:val="%7."/>
+      <w:lvlJc w:val="left"/>
+      <w:pPr>
+        <w:tabs>
+          <w:tab w:val="num" w:pos="5040"/>
+        </w:tabs>
+        <w:ind w:left="5040" w:hanging="360"/>
+      </w:pPr>
+    </w:lvl>
+    <w:lvl w:ilvl="7" w:tentative="1">
+      <w:start w:val="1"/>
+      <w:numFmt w:val="decimal"/>
+      <w:lvlText w:val="%8."/>
+      <w:lvlJc w:val="left"/>
+      <w:pPr>
+        <w:tabs>
+          <w:tab w:val="num" w:pos="5760"/>
+        </w:tabs>
+        <w:ind w:left="5760" w:hanging="360"/>
+      </w:pPr>
+    </w:lvl>
+    <w:lvl w:ilvl="8" w:tentative="1">
+      <w:start w:val="1"/>
+      <w:numFmt w:val="decimal"/>
+      <w:lvlText w:val="%9."/>
+      <w:lvlJc w:val="left"/>
+      <w:pPr>
+        <w:tabs>
+          <w:tab w:val="num" w:pos="6480"/>
+        </w:tabs>
+        <w:ind w:left="6480" w:hanging="360"/>
+      </w:pPr>
+    </w:lvl>
+  </w:abstractNum>
+  <w:abstractNum w:abstractNumId="40" w15:restartNumberingAfterBreak="0">
     <w:nsid w:val="4FC56C33"/>
     <w:multiLevelType w:val="multilevel"/>
     <w:tmpl w:val="46D83308"/>
@@ -44247,7 +47739,7 @@
       </w:rPr>
     </w:lvl>
   </w:abstractNum>
-  <w:abstractNum w:abstractNumId="40" w15:restartNumberingAfterBreak="0">
+  <w:abstractNum w:abstractNumId="41" w15:restartNumberingAfterBreak="0">
     <w:nsid w:val="516E2F63"/>
     <w:multiLevelType w:val="multilevel"/>
     <w:tmpl w:val="2DF8C730"/>
@@ -44396,7 +47888,7 @@
       </w:rPr>
     </w:lvl>
   </w:abstractNum>
-  <w:abstractNum w:abstractNumId="41" w15:restartNumberingAfterBreak="0">
+  <w:abstractNum w:abstractNumId="42" w15:restartNumberingAfterBreak="0">
     <w:nsid w:val="588665E5"/>
     <w:multiLevelType w:val="multilevel"/>
     <w:tmpl w:val="BE50A528"/>
@@ -44545,7 +48037,7 @@
       </w:rPr>
     </w:lvl>
   </w:abstractNum>
-  <w:abstractNum w:abstractNumId="42" w15:restartNumberingAfterBreak="0">
+  <w:abstractNum w:abstractNumId="43" w15:restartNumberingAfterBreak="0">
     <w:nsid w:val="58D663C3"/>
     <w:multiLevelType w:val="multilevel"/>
     <w:tmpl w:val="DD5EE852"/>
@@ -44694,7 +48186,7 @@
       </w:rPr>
     </w:lvl>
   </w:abstractNum>
-  <w:abstractNum w:abstractNumId="43" w15:restartNumberingAfterBreak="0">
+  <w:abstractNum w:abstractNumId="44" w15:restartNumberingAfterBreak="0">
     <w:nsid w:val="59182A99"/>
     <w:multiLevelType w:val="multilevel"/>
     <w:tmpl w:val="E462440E"/>
@@ -44843,7 +48335,7 @@
       </w:rPr>
     </w:lvl>
   </w:abstractNum>
-  <w:abstractNum w:abstractNumId="44" w15:restartNumberingAfterBreak="0">
+  <w:abstractNum w:abstractNumId="45" w15:restartNumberingAfterBreak="0">
     <w:nsid w:val="59BF3039"/>
     <w:multiLevelType w:val="multilevel"/>
     <w:tmpl w:val="5CAA7084"/>
@@ -44992,7 +48484,7 @@
       </w:rPr>
     </w:lvl>
   </w:abstractNum>
-  <w:abstractNum w:abstractNumId="45" w15:restartNumberingAfterBreak="0">
+  <w:abstractNum w:abstractNumId="46" w15:restartNumberingAfterBreak="0">
     <w:nsid w:val="623716EE"/>
     <w:multiLevelType w:val="multilevel"/>
     <w:tmpl w:val="CC88F8B8"/>
@@ -45141,7 +48633,7 @@
       </w:rPr>
     </w:lvl>
   </w:abstractNum>
-  <w:abstractNum w:abstractNumId="46" w15:restartNumberingAfterBreak="0">
+  <w:abstractNum w:abstractNumId="47" w15:restartNumberingAfterBreak="0">
     <w:nsid w:val="77CC1DFE"/>
     <w:multiLevelType w:val="multilevel"/>
     <w:tmpl w:val="8690A83C"/>
@@ -45290,7 +48782,7 @@
       </w:rPr>
     </w:lvl>
   </w:abstractNum>
-  <w:abstractNum w:abstractNumId="47" w15:restartNumberingAfterBreak="0">
+  <w:abstractNum w:abstractNumId="48" w15:restartNumberingAfterBreak="0">
     <w:nsid w:val="78A7040E"/>
     <w:multiLevelType w:val="multilevel"/>
     <w:tmpl w:val="8F26150C"/>
@@ -45403,7 +48895,7 @@
       </w:pPr>
     </w:lvl>
   </w:abstractNum>
-  <w:abstractNum w:abstractNumId="48" w15:restartNumberingAfterBreak="0">
+  <w:abstractNum w:abstractNumId="49" w15:restartNumberingAfterBreak="0">
     <w:nsid w:val="7BA411F7"/>
     <w:multiLevelType w:val="multilevel"/>
     <w:tmpl w:val="B15CB7BA"/>
@@ -45552,7 +49044,7 @@
       </w:rPr>
     </w:lvl>
   </w:abstractNum>
-  <w:abstractNum w:abstractNumId="49" w15:restartNumberingAfterBreak="0">
+  <w:abstractNum w:abstractNumId="50" w15:restartNumberingAfterBreak="0">
     <w:nsid w:val="7C30123D"/>
     <w:multiLevelType w:val="multilevel"/>
     <w:tmpl w:val="C0ECC33E"/>
@@ -45665,7 +49157,7 @@
       </w:pPr>
     </w:lvl>
   </w:abstractNum>
-  <w:abstractNum w:abstractNumId="50" w15:restartNumberingAfterBreak="0">
+  <w:abstractNum w:abstractNumId="51" w15:restartNumberingAfterBreak="0">
     <w:nsid w:val="7D672B9F"/>
     <w:multiLevelType w:val="multilevel"/>
     <w:tmpl w:val="40CC65B8"/>
@@ -45818,7 +49310,7 @@
     <w:abstractNumId w:val="14"/>
   </w:num>
   <w:num w:numId="2" w16cid:durableId="169569328">
-    <w:abstractNumId w:val="48"/>
+    <w:abstractNumId w:val="49"/>
   </w:num>
   <w:num w:numId="3" w16cid:durableId="1817527640">
     <w:abstractNumId w:val="21"/>
@@ -45845,7 +49337,7 @@
     <w:abstractNumId w:val="37"/>
   </w:num>
   <w:num w:numId="11" w16cid:durableId="1353996789">
-    <w:abstractNumId w:val="41"/>
+    <w:abstractNumId w:val="42"/>
   </w:num>
   <w:num w:numId="12" w16cid:durableId="1232275650">
     <w:abstractNumId w:val="31"/>
@@ -45866,7 +49358,7 @@
     <w:abstractNumId w:val="15"/>
   </w:num>
   <w:num w:numId="18" w16cid:durableId="1264462290">
-    <w:abstractNumId w:val="47"/>
+    <w:abstractNumId w:val="48"/>
     <w:lvlOverride w:ilvl="0">
       <w:startOverride w:val="1"/>
     </w:lvlOverride>
@@ -45890,16 +49382,16 @@
     <w:abstractNumId w:val="30"/>
   </w:num>
   <w:num w:numId="25" w16cid:durableId="622660805">
-    <w:abstractNumId w:val="42"/>
+    <w:abstractNumId w:val="43"/>
   </w:num>
   <w:num w:numId="26" w16cid:durableId="567301515">
     <w:abstractNumId w:val="8"/>
   </w:num>
   <w:num w:numId="27" w16cid:durableId="1436176364">
-    <w:abstractNumId w:val="46"/>
+    <w:abstractNumId w:val="47"/>
   </w:num>
   <w:num w:numId="28" w16cid:durableId="2054188751">
-    <w:abstractNumId w:val="40"/>
+    <w:abstractNumId w:val="41"/>
   </w:num>
   <w:num w:numId="29" w16cid:durableId="1901790573">
     <w:abstractNumId w:val="34"/>
@@ -45908,10 +49400,10 @@
     <w:abstractNumId w:val="16"/>
   </w:num>
   <w:num w:numId="31" w16cid:durableId="410276914">
-    <w:abstractNumId w:val="43"/>
+    <w:abstractNumId w:val="44"/>
   </w:num>
   <w:num w:numId="32" w16cid:durableId="1649506774">
-    <w:abstractNumId w:val="50"/>
+    <w:abstractNumId w:val="51"/>
   </w:num>
   <w:num w:numId="33" w16cid:durableId="287200659">
     <w:abstractNumId w:val="36"/>
@@ -45929,7 +49421,7 @@
     <w:abstractNumId w:val="29"/>
   </w:num>
   <w:num w:numId="37" w16cid:durableId="544290814">
-    <w:abstractNumId w:val="45"/>
+    <w:abstractNumId w:val="46"/>
   </w:num>
   <w:num w:numId="38" w16cid:durableId="1715617844">
     <w:abstractNumId w:val="22"/>
@@ -45941,7 +49433,7 @@
     <w:abstractNumId w:val="3"/>
   </w:num>
   <w:num w:numId="41" w16cid:durableId="1763722926">
-    <w:abstractNumId w:val="44"/>
+    <w:abstractNumId w:val="45"/>
   </w:num>
   <w:num w:numId="42" w16cid:durableId="2089113594">
     <w:abstractNumId w:val="1"/>
@@ -45956,7 +49448,7 @@
     <w:abstractNumId w:val="17"/>
   </w:num>
   <w:num w:numId="46" w16cid:durableId="1689064680">
-    <w:abstractNumId w:val="49"/>
+    <w:abstractNumId w:val="50"/>
   </w:num>
   <w:num w:numId="47" w16cid:durableId="609626935">
     <w:abstractNumId w:val="33"/>
@@ -45968,17 +49460,20 @@
     <w:abstractNumId w:val="5"/>
   </w:num>
   <w:num w:numId="50" w16cid:durableId="184680461">
-    <w:abstractNumId w:val="39"/>
+    <w:abstractNumId w:val="40"/>
   </w:num>
   <w:num w:numId="51" w16cid:durableId="2046829635">
     <w:abstractNumId w:val="28"/>
   </w:num>
-  <w:numIdMacAtCleanup w:val="41"/>
+  <w:num w:numId="52" w16cid:durableId="1088893203">
+    <w:abstractNumId w:val="39"/>
+  </w:num>
+  <w:numIdMacAtCleanup w:val="52"/>
 </w:numbering>
 </file>
 
 <file path=word/styles.xml><?xml version="1.0" encoding="utf-8"?>
-<w:styles xmlns:mc="http://schemas.openxmlformats.org/markup-compatibility/2006" xmlns:r="http://schemas.openxmlformats.org/officeDocument/2006/relationships" xmlns:w="http://schemas.openxmlformats.org/wordprocessingml/2006/main" xmlns:w14="http://schemas.microsoft.com/office/word/2010/wordml" xmlns:w15="http://schemas.microsoft.com/office/word/2012/wordml" xmlns:w16cex="http://schemas.microsoft.com/office/word/2018/wordml/cex" xmlns:w16cid="http://schemas.microsoft.com/office/word/2016/wordml/cid" xmlns:w16="http://schemas.microsoft.com/office/word/2018/wordml" xmlns:w16sdtdh="http://schemas.microsoft.com/office/word/2020/wordml/sdtdatahash" xmlns:w16sdtfl="http://schemas.microsoft.com/office/word/2024/wordml/sdtformatlock" xmlns:w16se="http://schemas.microsoft.com/office/word/2015/wordml/symex" xmlns:w16du="http://schemas.microsoft.com/office/word/2023/wordml/word16du" mc:Ignorable="w14 w15 w16se w16cid w16 w16cex w16sdtdh w16sdtfl w16du">
+<w:styles xmlns:mc="http://schemas.openxmlformats.org/markup-compatibility/2006" xmlns:r="http://schemas.openxmlformats.org/officeDocument/2006/relationships" xmlns:w="http://schemas.openxmlformats.org/wordprocessingml/2006/main" xmlns:w14="http://schemas.microsoft.com/office/word/2010/wordml" xmlns:w15="http://schemas.microsoft.com/office/word/2012/wordml" xmlns:w16cex="http://schemas.microsoft.com/office/word/2018/wordml/cex" xmlns:w16cid="http://schemas.microsoft.com/office/word/2016/wordml/cid" xmlns:w16="http://schemas.microsoft.com/office/word/2018/wordml" xmlns:w16du="http://schemas.microsoft.com/office/word/2023/wordml/word16du" xmlns:w16sdtdh="http://schemas.microsoft.com/office/word/2020/wordml/sdtdatahash" xmlns:w16sdtfl="http://schemas.microsoft.com/office/word/2024/wordml/sdtformatlock" xmlns:w16se="http://schemas.microsoft.com/office/word/2015/wordml/symex" mc:Ignorable="w14 w15 w16se w16cid w16 w16cex w16sdtdh w16sdtfl w16du">
   <w:docDefaults>
     <w:rPrDefault>
       <w:rPr>

</xml_diff>